<commit_message>
Enforce authoritative code and evidence gates
</commit_message>
<xml_diff>
--- a/docs/AeroLink Technical Overview.docx
+++ b/docs/AeroLink Technical Overview.docx
@@ -445,7 +445,7 @@
           <w:color w:val="17324D"/>
           <w:sz w:val="22"/>
         </w:rPr>
-        <w:t>Digital Thread follows exact baseline revisions through SYSR → HLR → LLR → procedure → execution/result → evidence → software build. It is a projection over authoritative records, not a second trace database. Focused traversal and evidence views remain available for deeper investigation.</w:t>
+        <w:t>Digital Thread follows exact baseline revisions through SYSR → HLR → LLR → procedure → execution/result → evidence → software build. When several procedures cover an exact requirement, it prefers a build-scoped result with linked checksummed evidence; an external text reference remains context, not proof of an attached file.</w:t>
       </w:r>
     </w:p>
     <w:p>
@@ -461,7 +461,7 @@
           <w:color w:val="17324D"/>
           <w:sz w:val="22"/>
         </w:rPr>
-        <w:t>GitLab remains authoritative for repositories, source, merge requests, review, CI, and commit content. AeroLink records an immutable pointer from an exact approved LLR revision to a GitLab MR and merge commit SHA, or a justified No code change required decision. AeroLink does not host or review code.</w:t>
+        <w:t>GitLab remains authoritative for repositories, source, merge requests, review, CI, and commit content. AeroLink records an immutable pointer from an exact approved LLR revision to a GitLab MR and merge commit SHA, or a justified No code change required decision. The same exact-LLR scope drives the Code workspace, release gate, and signed review manifest; AeroLink does not host or review code.</w:t>
       </w:r>
     </w:p>
     <w:p>

</xml_diff>

<commit_message>
Enforce authoritative code and evidence gates (#287)
* Enforce authoritative code and evidence gates

* Record post-delivery challenge review

* Align readiness journey with code gate

* Restrict thread evidence to exact builds
</commit_message>
<xml_diff>
--- a/docs/AeroLink Technical Overview.docx
+++ b/docs/AeroLink Technical Overview.docx
@@ -445,7 +445,7 @@
           <w:color w:val="17324D"/>
           <w:sz w:val="22"/>
         </w:rPr>
-        <w:t>Digital Thread follows exact baseline revisions through SYSR → HLR → LLR → procedure → execution/result → evidence → software build. It is a projection over authoritative records, not a second trace database. Focused traversal and evidence views remain available for deeper investigation.</w:t>
+        <w:t>Digital Thread follows exact baseline revisions through SYSR → HLR → LLR → procedure → execution/result → evidence → software build. When several procedures cover an exact requirement, it prefers a build-scoped result with linked checksummed evidence; an external text reference remains context, not proof of an attached file.</w:t>
       </w:r>
     </w:p>
     <w:p>
@@ -461,7 +461,7 @@
           <w:color w:val="17324D"/>
           <w:sz w:val="22"/>
         </w:rPr>
-        <w:t>GitLab remains authoritative for repositories, source, merge requests, review, CI, and commit content. AeroLink records an immutable pointer from an exact approved LLR revision to a GitLab MR and merge commit SHA, or a justified No code change required decision. AeroLink does not host or review code.</w:t>
+        <w:t>GitLab remains authoritative for repositories, source, merge requests, review, CI, and commit content. AeroLink records an immutable pointer from an exact approved LLR revision to a GitLab MR and merge commit SHA, or a justified No code change required decision. The same exact-LLR scope drives the Code workspace, release gate, and signed review manifest; AeroLink does not host or review code.</w:t>
       </w:r>
     </w:p>
     <w:p>

</xml_diff>

<commit_message>
Add controlled Word Documentation Center
</commit_message>
<xml_diff>
--- a/docs/AeroLink Technical Overview.docx
+++ b/docs/AeroLink Technical Overview.docx
@@ -4,559 +4,601 @@
   <w:body>
     <w:p>
       <w:pPr>
-        <w:keepNext/>
-        <w:spacing w:before="200" w:after="40" w:line="264" w:lineRule="auto"/>
+        <w:spacing w:before="100" w:after="20"/>
       </w:pPr>
       <w:r>
         <w:rPr>
-          <w:rFonts w:ascii="Calibri" w:hAnsi="Calibri"/>
+          <w:rFonts w:ascii="Aptos Display" w:hAnsi="Aptos Display"/>
           <w:b/>
-          <w:i w:val="0"/>
-          <w:color w:val="17324D"/>
-          <w:sz w:val="46"/>
+          <w:color w:val="102A43"/>
+          <w:sz w:val="56"/>
         </w:rPr>
-        <w:t>AeroLink Technical Overview</w:t>
+        <w:t>AeroLink</w:t>
       </w:r>
     </w:p>
     <w:p>
       <w:pPr>
-        <w:keepNext/>
-        <w:spacing w:before="0" w:after="240" w:line="264" w:lineRule="auto"/>
+        <w:spacing w:after="100"/>
         <w:pBdr>
-          <w:bottom w:val="single" w:sz="18" w:space="10" w:color="2E74B5"/>
+          <w:bottom w:val="single" w:sz="18" w:space="6" w:color="168578"/>
         </w:pBdr>
       </w:pPr>
       <w:r>
         <w:rPr>
-          <w:rFonts w:ascii="Calibri" w:hAnsi="Calibri"/>
-          <w:b w:val="0"/>
-          <w:i w:val="0"/>
-          <w:color w:val="5C6C7E"/>
-          <w:sz w:val="25"/>
+          <w:b/>
+          <w:color w:val="168578"/>
+          <w:sz w:val="26"/>
         </w:rPr>
-        <w:t>Architecture, data, version control, and operational assurance</w:t>
+        <w:t>How the platform, database, version control, and Word document lifecycle work</w:t>
       </w:r>
     </w:p>
     <w:p>
       <w:pPr>
-        <w:keepNext w:val="0"/>
-        <w:spacing w:before="0" w:after="40" w:line="264" w:lineRule="auto"/>
+        <w:spacing w:after="140"/>
       </w:pPr>
       <w:r>
         <w:rPr>
-          <w:rFonts w:ascii="Calibri" w:hAnsi="Calibri"/>
           <w:b/>
-          <w:i w:val="0"/>
-          <w:color w:val="2E74B5"/>
-          <w:sz w:val="22"/>
+          <w:color w:val="526274"/>
+          <w:sz w:val="15"/>
         </w:rPr>
-        <w:t xml:space="preserve">Audience  </w:t>
-      </w:r>
-      <w:r>
-        <w:rPr>
-          <w:rFonts w:ascii="Calibri" w:hAnsi="Calibri"/>
-          <w:b w:val="0"/>
-          <w:i w:val="0"/>
-          <w:color w:val="17324D"/>
-          <w:sz w:val="22"/>
-        </w:rPr>
-        <w:t>Software, systems, verification, configuration-management, and IT colleagues</w:t>
+        <w:t>FOR SOFTWARE, SYSTEMS, VERIFICATION, CONFIGURATION-MANAGEMENT, AND IT COLLEAGUES</w:t>
       </w:r>
     </w:p>
     <w:p>
       <w:pPr>
-        <w:keepNext w:val="0"/>
-        <w:spacing w:before="0" w:after="200" w:line="264" w:lineRule="auto"/>
+        <w:spacing w:before="160" w:after="60"/>
       </w:pPr>
       <w:r>
         <w:rPr>
-          <w:rFonts w:ascii="Calibri" w:hAnsi="Calibri"/>
           <w:b/>
-          <w:i w:val="0"/>
           <w:color w:val="2E74B5"/>
-          <w:sz w:val="22"/>
+          <w:sz w:val="26"/>
         </w:rPr>
-        <w:t xml:space="preserve">Scope  </w:t>
-      </w:r>
-      <w:r>
-        <w:rPr>
-          <w:rFonts w:ascii="Calibri" w:hAnsi="Calibri"/>
-          <w:b w:val="0"/>
-          <w:i w:val="0"/>
-          <w:color w:val="17324D"/>
-          <w:sz w:val="22"/>
-        </w:rPr>
-        <w:t>Current implementation; concise companion to the authoritative repository documents</w:t>
+        <w:t>1  System shape</w:t>
       </w:r>
     </w:p>
     <w:p>
       <w:pPr>
-        <w:pStyle w:val="Heading1"/>
+        <w:spacing w:after="80" w:line="250" w:lineRule="auto"/>
       </w:pPr>
       <w:r>
-        <w:t>1. System shape</w:t>
+        <w:t>AeroLink is a local/on-premises modular monolith. A React and TypeScript browser client calls an ASP.NET Core API on .NET 10. Entity Framework Core maps controlled domain records to PostgreSQL. SQLite is used only for isolated automated tests. The production-shaped launcher builds the client and serves browser and API traffic from one origin; development uses a Vite client beside the API.</w:t>
       </w:r>
     </w:p>
     <w:p>
       <w:pPr>
-        <w:keepNext w:val="0"/>
-        <w:spacing w:before="0" w:after="140" w:line="264" w:lineRule="auto"/>
+        <w:spacing w:after="80" w:line="250" w:lineRule="auto"/>
+      </w:pPr>
+      <w:r>
+        <w:t>Lifecycle rules live in domain objects, not in presentation code. The API authenticates the caller, verifies Project/build context and role authority, executes one domain operation, and persists its resulting state plus audit or signature evidence. Released-build mutation guards and independent-review rules are therefore enforced even when a client request is crafted manually.</w:t>
+      </w:r>
+    </w:p>
+    <w:tbl>
+      <w:tblPr>
+        <w:tblW w:type="auto" w:w="0"/>
+        <w:tblLayout w:type="fixed"/>
+        <w:tblLook w:firstColumn="1" w:firstRow="1" w:lastColumn="0" w:lastRow="0" w:noHBand="0" w:noVBand="1" w:val="04A0"/>
+      </w:tblPr>
+      <w:tblGrid>
+        <w:gridCol w:w="3427"/>
+        <w:gridCol w:w="3427"/>
+        <w:gridCol w:w="3427"/>
+      </w:tblGrid>
+      <w:tr>
+        <w:tc>
+          <w:tcPr>
+            <w:tcW w:type="dxa" w:w="2952"/>
+            <w:shd w:fill="102A43"/>
+            <w:vAlign w:val="center"/>
+          </w:tcPr>
+          <w:p>
+            <w:r>
+              <w:rPr>
+                <w:b/>
+                <w:color w:val="FFFFFF"/>
+              </w:rPr>
+              <w:t>Browser</w:t>
+            </w:r>
+          </w:p>
+        </w:tc>
+        <w:tc>
+          <w:tcPr>
+            <w:tcW w:type="dxa" w:w="2952"/>
+            <w:shd w:fill="102A43"/>
+            <w:vAlign w:val="center"/>
+          </w:tcPr>
+          <w:p>
+            <w:r>
+              <w:rPr>
+                <w:b/>
+                <w:color w:val="FFFFFF"/>
+              </w:rPr>
+              <w:t>Application</w:t>
+            </w:r>
+          </w:p>
+        </w:tc>
+        <w:tc>
+          <w:tcPr>
+            <w:tcW w:type="dxa" w:w="3960"/>
+            <w:shd w:fill="102A43"/>
+            <w:vAlign w:val="center"/>
+          </w:tcPr>
+          <w:p>
+            <w:r>
+              <w:rPr>
+                <w:b/>
+                <w:color w:val="FFFFFF"/>
+              </w:rPr>
+              <w:t>Controlled data</w:t>
+            </w:r>
+          </w:p>
+        </w:tc>
+      </w:tr>
+      <w:tr>
+        <w:tc>
+          <w:tcPr>
+            <w:tcW w:type="dxa" w:w="2952"/>
+            <w:shd w:fill="EAF2F5"/>
+          </w:tcPr>
+          <w:p>
+            <w:r>
+              <w:t>React / TypeScript</w:t>
+            </w:r>
+          </w:p>
+        </w:tc>
+        <w:tc>
+          <w:tcPr>
+            <w:tcW w:type="dxa" w:w="2952"/>
+            <w:shd w:fill="EAF2F5"/>
+          </w:tcPr>
+          <w:p>
+            <w:r>
+              <w:t>.NET API + domain rules</w:t>
+            </w:r>
+          </w:p>
+        </w:tc>
+        <w:tc>
+          <w:tcPr>
+            <w:tcW w:type="dxa" w:w="3960"/>
+            <w:shd w:fill="EAF2F5"/>
+          </w:tcPr>
+          <w:p>
+            <w:r>
+              <w:t>PostgreSQL metadata</w:t>
+            </w:r>
+          </w:p>
+        </w:tc>
+      </w:tr>
+      <w:tr>
+        <w:tc>
+          <w:tcPr>
+            <w:tcW w:type="dxa" w:w="2952"/>
+            <w:shd w:fill="FFFFFF"/>
+          </w:tcPr>
+          <w:p>
+            <w:r>
+              <w:t>Build-scoped routes</w:t>
+            </w:r>
+          </w:p>
+        </w:tc>
+        <w:tc>
+          <w:tcPr>
+            <w:tcW w:type="dxa" w:w="2952"/>
+            <w:shd w:fill="FFFFFF"/>
+          </w:tcPr>
+          <w:p>
+            <w:r>
+              <w:t>EF Core migrations</w:t>
+            </w:r>
+          </w:p>
+        </w:tc>
+        <w:tc>
+          <w:tcPr>
+            <w:tcW w:type="dxa" w:w="3960"/>
+            <w:shd w:fill="FFFFFF"/>
+          </w:tcPr>
+          <w:p>
+            <w:r>
+              <w:t>Checksummed evidence store</w:t>
+            </w:r>
+          </w:p>
+        </w:tc>
+      </w:tr>
+      <w:tr>
+        <w:tc>
+          <w:tcPr>
+            <w:tcW w:type="dxa" w:w="2952"/>
+            <w:shd w:fill="EAF2F5"/>
+          </w:tcPr>
+          <w:p>
+            <w:r>
+              <w:t>Explanatory UI</w:t>
+            </w:r>
+          </w:p>
+        </w:tc>
+        <w:tc>
+          <w:tcPr>
+            <w:tcW w:type="dxa" w:w="2952"/>
+            <w:shd w:fill="EAF2F5"/>
+          </w:tcPr>
+          <w:p>
+            <w:r>
+              <w:t>Authorization + audit</w:t>
+            </w:r>
+          </w:p>
+        </w:tc>
+        <w:tc>
+          <w:tcPr>
+            <w:tcW w:type="dxa" w:w="3960"/>
+            <w:shd w:fill="EAF2F5"/>
+          </w:tcPr>
+          <w:p>
+            <w:r>
+              <w:t>Immutable selections and files</w:t>
+            </w:r>
+          </w:p>
+        </w:tc>
+      </w:tr>
+    </w:tbl>
+    <w:p>
+      <w:pPr>
+        <w:spacing w:before="160" w:after="60"/>
       </w:pPr>
       <w:r>
         <w:rPr>
-          <w:rFonts w:ascii="Calibri" w:hAnsi="Calibri"/>
-          <w:b w:val="0"/>
-          <w:i w:val="0"/>
-          <w:color w:val="17324D"/>
-          <w:sz w:val="22"/>
+          <w:b/>
+          <w:color w:val="2E74B5"/>
+          <w:sz w:val="26"/>
         </w:rPr>
-        <w:t>AeroLink is a modular monolith: a React/TypeScript browser client calls an ASP.NET Core API on .NET 10. Entity Framework Core provides persistence. PostgreSQL is the normal local/on-premises database; SQLite is used only for isolated automated tests. The production-shaped launcher serves the built client and API from one origin, while development uses Vite plus the API.</w:t>
+        <w:t>2  Database and controlled records</w:t>
       </w:r>
     </w:p>
     <w:p>
       <w:pPr>
-        <w:keepNext w:val="0"/>
-        <w:spacing w:before="0" w:after="140" w:line="264" w:lineRule="auto"/>
+        <w:spacing w:after="80" w:line="250" w:lineRule="auto"/>
       </w:pPr>
       <w:r>
-        <w:rPr>
-          <w:rFonts w:ascii="Calibri" w:hAnsi="Calibri"/>
-          <w:b w:val="0"/>
-          <w:i w:val="0"/>
-          <w:color w:val="17324D"/>
-          <w:sz w:val="22"/>
-        </w:rPr>
-        <w:t>Lifecycle rules live in domain objects. Endpoints authenticate the caller, validate Project/build scope and role authority, invoke the domain operation, and persist state plus audit or integration evidence atomically. The browser explains state, but it is not the control boundary: released-build mutation protection and role separation are enforced server-side.</w:t>
+        <w:t>PostgreSQL is the one real-life database. EF Core migrations version the schema and run at application startup; migrations add or transform structures without resetting persistent engineering records. Stable identities such as SRCR-00076, LLR-000008, or SDP-000001 remain separate from immutable formal revisions such as .00 and .01.</w:t>
       </w:r>
     </w:p>
     <w:p>
       <w:pPr>
-        <w:pStyle w:val="Heading1"/>
+        <w:pStyle w:val="ListBullet"/>
+        <w:spacing w:after="40"/>
       </w:pPr>
       <w:r>
-        <w:t>2. Request and transaction path</w:t>
+        <w:t>Requirements: a change request proposes a new exact revision; ordered review and electronic signatures approve the snapshot; a build baseline selects exact revision IDs.</w:t>
       </w:r>
     </w:p>
     <w:p>
       <w:pPr>
-        <w:keepNext w:val="0"/>
-        <w:spacing w:before="0" w:after="100" w:line="264" w:lineRule="auto"/>
+        <w:pStyle w:val="ListBullet"/>
+        <w:spacing w:after="40"/>
       </w:pPr>
       <w:r>
-        <w:rPr>
-          <w:rFonts w:ascii="Calibri" w:hAnsi="Calibri"/>
-          <w:b/>
-          <w:i w:val="0"/>
-          <w:color w:val="2E74B5"/>
-          <w:sz w:val="22"/>
-        </w:rPr>
-        <w:t xml:space="preserve">1 • Client  </w:t>
-      </w:r>
-      <w:r>
-        <w:rPr>
-          <w:rFonts w:ascii="Calibri" w:hAnsi="Calibri"/>
-          <w:b w:val="0"/>
-          <w:i w:val="0"/>
-          <w:color w:val="17324D"/>
-          <w:sz w:val="22"/>
-        </w:rPr>
-        <w:t>Sends an authenticated request carrying the deep-linked Program, Project, build, and artifact context.</w:t>
+        <w:t>Verification: procedures, executions, results, and evidence are separate controlled records joined to exact revisions and builds.</w:t>
       </w:r>
     </w:p>
     <w:p>
       <w:pPr>
-        <w:keepNext w:val="0"/>
-        <w:spacing w:before="0" w:after="100" w:line="264" w:lineRule="auto"/>
+        <w:pStyle w:val="ListBullet"/>
+        <w:spacing w:after="40"/>
       </w:pPr>
       <w:r>
-        <w:rPr>
-          <w:rFonts w:ascii="Calibri" w:hAnsi="Calibri"/>
-          <w:b/>
-          <w:i w:val="0"/>
-          <w:color w:val="2E74B5"/>
-          <w:sz w:val="22"/>
-        </w:rPr>
-        <w:t xml:space="preserve">2 • API  </w:t>
-      </w:r>
-      <w:r>
-        <w:rPr>
-          <w:rFonts w:ascii="Calibri" w:hAnsi="Calibri"/>
-          <w:b w:val="0"/>
-          <w:i w:val="0"/>
-          <w:color w:val="17324D"/>
-          <w:sz w:val="22"/>
-        </w:rPr>
-        <w:t>Checks session, anti-forgery protection, membership, role, resource ownership, and build isolation.</w:t>
+        <w:t>Managed documents: PostgreSQL holds register identity, formal revision, build selection, review route, signatures, links, locks, and hashes; the evidence store holds DOCX/PDF bytes.</w:t>
       </w:r>
     </w:p>
     <w:p>
       <w:pPr>
-        <w:keepNext w:val="0"/>
-        <w:spacing w:before="0" w:after="100" w:line="264" w:lineRule="auto"/>
+        <w:pStyle w:val="ListBullet"/>
+        <w:spacing w:after="40"/>
       </w:pPr>
       <w:r>
-        <w:rPr>
-          <w:rFonts w:ascii="Calibri" w:hAnsi="Calibri"/>
-          <w:b/>
-          <w:i w:val="0"/>
-          <w:color w:val="2E74B5"/>
-          <w:sz w:val="22"/>
-        </w:rPr>
-        <w:t xml:space="preserve">3 • Domain  </w:t>
-      </w:r>
-      <w:r>
-        <w:rPr>
-          <w:rFonts w:ascii="Calibri" w:hAnsi="Calibri"/>
-          <w:b w:val="0"/>
-          <w:i w:val="0"/>
-          <w:color w:val="17324D"/>
-          <w:sz w:val="22"/>
-        </w:rPr>
-        <w:t>Applies state-machine, independence, revision, rationale, and signature rules.</w:t>
+        <w:t>Integrity: foreign keys, unique constraints, concurrency versions, SHA-256 hashes, append-only events, and server-side build guards protect relationships.</w:t>
       </w:r>
     </w:p>
     <w:p>
       <w:pPr>
-        <w:keepNext w:val="0"/>
-        <w:spacing w:before="0" w:after="100" w:line="264" w:lineRule="auto"/>
+        <w:sectPr>
+          <w:headerReference w:type="default" r:id="rId9"/>
+          <w:footerReference w:type="default" r:id="rId10"/>
+          <w:pgSz w:w="12240" w:h="15840"/>
+          <w:pgMar w:top="835" w:right="979" w:bottom="792" w:left="979" w:header="720" w:footer="720" w:gutter="0"/>
+          <w:cols w:space="720"/>
+          <w:docGrid w:linePitch="360"/>
+        </w:sectPr>
+      </w:pPr>
+    </w:p>
+    <w:p>
+      <w:pPr>
+        <w:spacing w:before="160" w:after="60"/>
       </w:pPr>
       <w:r>
         <w:rPr>
-          <w:rFonts w:ascii="Calibri" w:hAnsi="Calibri"/>
           <w:b/>
-          <w:i w:val="0"/>
           <w:color w:val="2E74B5"/>
-          <w:sz w:val="22"/>
+          <w:sz w:val="26"/>
         </w:rPr>
-        <w:t xml:space="preserve">4 • Persistence  </w:t>
+        <w:t>3  Four complementary version controls</w:t>
       </w:r>
+    </w:p>
+    <w:tbl>
+      <w:tblPr>
+        <w:tblW w:type="auto" w:w="0"/>
+        <w:tblLayout w:type="fixed"/>
+        <w:tblLook w:firstColumn="1" w:firstRow="1" w:lastColumn="0" w:lastRow="0" w:noHBand="0" w:noVBand="1" w:val="04A0"/>
+      </w:tblPr>
+      <w:tblGrid>
+        <w:gridCol w:w="5141"/>
+        <w:gridCol w:w="5141"/>
+      </w:tblGrid>
+      <w:tr>
+        <w:tc>
+          <w:tcPr>
+            <w:tcW w:type="dxa" w:w="5141"/>
+            <w:shd w:fill="102A43"/>
+          </w:tcPr>
+          <w:p>
+            <w:r>
+              <w:rPr>
+                <w:b/>
+                <w:color w:val="FFFFFF"/>
+              </w:rPr>
+              <w:t>Control</w:t>
+            </w:r>
+          </w:p>
+        </w:tc>
+        <w:tc>
+          <w:tcPr>
+            <w:tcW w:type="dxa" w:w="5141"/>
+            <w:shd w:fill="102A43"/>
+          </w:tcPr>
+          <w:p>
+            <w:r>
+              <w:rPr>
+                <w:b/>
+                <w:color w:val="FFFFFF"/>
+              </w:rPr>
+              <w:t>What it fixes in time</w:t>
+            </w:r>
+          </w:p>
+        </w:tc>
+      </w:tr>
+      <w:tr>
+        <w:tc>
+          <w:tcPr>
+            <w:tcW w:type="dxa" w:w="5141"/>
+            <w:shd w:fill="EAF2F5"/>
+          </w:tcPr>
+          <w:p>
+            <w:r>
+              <w:rPr>
+                <w:b/>
+              </w:rPr>
+              <w:t>Git / GitHub</w:t>
+            </w:r>
+          </w:p>
+        </w:tc>
+        <w:tc>
+          <w:tcPr>
+            <w:tcW w:type="dxa" w:w="5141"/>
+          </w:tcPr>
+          <w:p>
+            <w:r>
+              <w:t>Application source and repository documentation; focused branches, pull requests, CI, and reviewed main.</w:t>
+            </w:r>
+          </w:p>
+        </w:tc>
+      </w:tr>
+      <w:tr>
+        <w:tc>
+          <w:tcPr>
+            <w:tcW w:type="dxa" w:w="5141"/>
+            <w:shd w:fill="EAF2F5"/>
+          </w:tcPr>
+          <w:p>
+            <w:r>
+              <w:rPr>
+                <w:b/>
+              </w:rPr>
+              <w:t>Artifact revisions</w:t>
+            </w:r>
+          </w:p>
+        </w:tc>
+        <w:tc>
+          <w:tcPr>
+            <w:tcW w:type="dxa" w:w="5141"/>
+          </w:tcPr>
+          <w:p>
+            <w:r>
+              <w:t>The exact engineering statement, procedure, problem, change, or managed document revision that was reviewed.</w:t>
+            </w:r>
+          </w:p>
+        </w:tc>
+      </w:tr>
+      <w:tr>
+        <w:tc>
+          <w:tcPr>
+            <w:tcW w:type="dxa" w:w="5141"/>
+            <w:shd w:fill="EAF2F5"/>
+          </w:tcPr>
+          <w:p>
+            <w:r>
+              <w:rPr>
+                <w:b/>
+              </w:rPr>
+              <w:t>Build baselines</w:t>
+            </w:r>
+          </w:p>
+        </w:tc>
+        <w:tc>
+          <w:tcPr>
+            <w:tcW w:type="dxa" w:w="5141"/>
+          </w:tcPr>
+          <w:p>
+            <w:r>
+              <w:t>The exact approved requirement and verification configuration selected for Build 1.5, 1.6, or a successor.</w:t>
+            </w:r>
+          </w:p>
+        </w:tc>
+      </w:tr>
+      <w:tr>
+        <w:tc>
+          <w:tcPr>
+            <w:tcW w:type="dxa" w:w="5141"/>
+            <w:shd w:fill="EAF2F5"/>
+          </w:tcPr>
+          <w:p>
+            <w:r>
+              <w:rPr>
+                <w:b/>
+              </w:rPr>
+              <w:t>Files and publications</w:t>
+            </w:r>
+          </w:p>
+        </w:tc>
+        <w:tc>
+          <w:tcPr>
+            <w:tcW w:type="dxa" w:w="5141"/>
+          </w:tcPr>
+          <w:p>
+            <w:r>
+              <w:t>Every working DOCX version, released DOCX/PDF pair, generated publication, and package by source and SHA-256 hash.</w:t>
+            </w:r>
+          </w:p>
+        </w:tc>
+      </w:tr>
+    </w:tbl>
+    <w:p>
+      <w:pPr>
+        <w:spacing w:before="160" w:after="60"/>
+      </w:pPr>
       <w:r>
         <w:rPr>
-          <w:rFonts w:ascii="Calibri" w:hAnsi="Calibri"/>
-          <w:b w:val="0"/>
-          <w:i w:val="0"/>
-          <w:color w:val="17324D"/>
-          <w:sz w:val="22"/>
+          <w:b/>
+          <w:color w:val="2E74B5"/>
+          <w:sz w:val="26"/>
         </w:rPr>
-        <w:t>Writes the controlled record, history, and durable event evidence in one database transaction.</w:t>
+        <w:t>4  Word-authored documentation lifecycle</w:t>
       </w:r>
     </w:p>
     <w:p>
       <w:pPr>
-        <w:keepNext w:val="0"/>
-        <w:spacing w:before="0" w:after="100" w:line="264" w:lineRule="auto"/>
+        <w:spacing w:after="80" w:line="250" w:lineRule="auto"/>
       </w:pPr>
       <w:r>
-        <w:rPr>
-          <w:rFonts w:ascii="Calibri" w:hAnsi="Calibri"/>
-          <w:b/>
-          <w:i w:val="0"/>
-          <w:color w:val="2E74B5"/>
-          <w:sz w:val="22"/>
-        </w:rPr>
-        <w:t xml:space="preserve">5 • Projection  </w:t>
-      </w:r>
-      <w:r>
-        <w:rPr>
-          <w:rFonts w:ascii="Calibri" w:hAnsi="Calibri"/>
-          <w:b w:val="0"/>
-          <w:i w:val="0"/>
-          <w:color w:val="17324D"/>
-          <w:sz w:val="22"/>
-        </w:rPr>
-        <w:t>Returns a permission-safe view; refresh and direct links rebuild the same context from durable identifiers.</w:t>
+        <w:t>Documentation Center deliberately keeps Word as the authoring tool. The per-user Windows connector redeems a one-use scoped grant, downloads the exact current DOCX, opens Microsoft Word, and maintains an exclusive lease. Check-in creates a new immutable working-file version with a required comment; discard closes the checkout without changing the authoritative source. Stale-source check-ins fail rather than overwrite another user's work.</w:t>
       </w:r>
     </w:p>
     <w:p>
       <w:pPr>
-        <w:pStyle w:val="Heading1"/>
+        <w:pStyle w:val="ListBullet"/>
+        <w:spacing w:after="40"/>
       </w:pPr>
       <w:r>
-        <w:t>3. PostgreSQL and controlled records</w:t>
+        <w:t>Draft is a visible lifecycle state, not a separate acronym. Every Draft section must retain a faint Draft watermark.</w:t>
       </w:r>
     </w:p>
     <w:p>
       <w:pPr>
-        <w:keepNext w:val="0"/>
-        <w:spacing w:before="0" w:after="140" w:line="264" w:lineRule="auto"/>
+        <w:pStyle w:val="ListBullet"/>
+        <w:spacing w:after="40"/>
       </w:pPr>
       <w:r>
-        <w:rPr>
-          <w:rFonts w:ascii="Calibri" w:hAnsi="Calibri"/>
-          <w:b w:val="0"/>
-          <w:i w:val="0"/>
-          <w:color w:val="17324D"/>
-          <w:sz w:val="22"/>
-        </w:rPr>
-        <w:t>PostgreSQL is the one real-life database. EF Core migrations version its schema and run at startup. Stable artifacts (for example SCR-00076 or LLR-000008) are separate from immutable revisions (.00, .01). Approved content is never edited in place: a change request proposes a successor, ordered review and electronic signatures approve it, and baseline materialization selects exact revision IDs for a build.</w:t>
+        <w:t>The author, technical reviewer, and final SQA/configuration approver must be different people.</w:t>
       </w:r>
     </w:p>
     <w:p>
       <w:pPr>
-        <w:keepNext w:val="0"/>
-        <w:spacing w:before="0" w:after="0" w:line="264" w:lineRule="auto"/>
+        <w:pStyle w:val="ListBullet"/>
+        <w:spacing w:after="40"/>
       </w:pPr>
       <w:r>
-        <w:rPr>
-          <w:rFonts w:ascii="Calibri" w:hAnsi="Calibri"/>
-          <w:b w:val="0"/>
-          <w:i w:val="0"/>
-          <w:color w:val="17324D"/>
-          <w:sz w:val="22"/>
-        </w:rPr>
-        <w:t>Foreign keys, unique constraints, concurrency tokens, append-only history, hashes, and server-side build guards protect the relationships. Build 1.5 resolves to its released baseline. Build 1.6 inherits that exact baseline until its own candidate is materialized, while its changes, assessments, tests, Problem Reports, and code mappings remain a separate active layer.</w:t>
-      </w:r>
-    </w:p>
-    <w:p>
-      <w:r>
-        <w:br w:type="page"/>
+        <w:t>At final review, Word produces a watermark-free DOCX and PDF labeled Release Candidate. AeroLink rejects any pair still marked Draft, then validates and hashes the exact candidate before release.</w:t>
       </w:r>
     </w:p>
     <w:p>
       <w:pPr>
-        <w:pStyle w:val="Heading1"/>
+        <w:pStyle w:val="ListBullet"/>
+        <w:spacing w:after="40"/>
       </w:pPr>
       <w:r>
-        <w:t>4. Four complementary kinds of version control</w:t>
+        <w:t>Build 1.5 projects only its released selection and is read-only; Build 1.6 can carry that release beside one active successor.</w:t>
       </w:r>
     </w:p>
     <w:p>
       <w:pPr>
-        <w:keepNext w:val="0"/>
-        <w:spacing w:before="0" w:after="100" w:line="264" w:lineRule="auto"/>
+        <w:pStyle w:val="ListBullet"/>
+        <w:spacing w:after="40"/>
       </w:pPr>
       <w:r>
-        <w:rPr>
-          <w:rFonts w:ascii="Calibri" w:hAnsi="Calibri"/>
-          <w:b/>
-          <w:i w:val="0"/>
-          <w:color w:val="2E74B5"/>
-          <w:sz w:val="22"/>
-        </w:rPr>
-        <w:t xml:space="preserve">Application source  </w:t>
-      </w:r>
-      <w:r>
-        <w:rPr>
-          <w:rFonts w:ascii="Calibri" w:hAnsi="Calibri"/>
-          <w:b w:val="0"/>
-          <w:i w:val="0"/>
-          <w:color w:val="17324D"/>
-          <w:sz w:val="22"/>
-        </w:rPr>
-        <w:t>Git and GitHub version code and documentation. Work uses focused codex/* branches, pull requests, CI, and squash merges; implementation is never pushed directly to main.</w:t>
+        <w:t>Links select existing same-Project change requests, Problem Reports, Test Change Requests, and builds and remain attached to the exact document revision.</w:t>
       </w:r>
     </w:p>
     <w:p>
       <w:pPr>
-        <w:keepNext w:val="0"/>
-        <w:spacing w:before="0" w:after="100" w:line="264" w:lineRule="auto"/>
+        <w:spacing w:before="160" w:after="60"/>
       </w:pPr>
       <w:r>
         <w:rPr>
-          <w:rFonts w:ascii="Calibri" w:hAnsi="Calibri"/>
           <w:b/>
-          <w:i w:val="0"/>
           <w:color w:val="2E74B5"/>
-          <w:sz w:val="22"/>
+          <w:sz w:val="26"/>
         </w:rPr>
-        <w:t xml:space="preserve">Engineering artifacts  </w:t>
-      </w:r>
-      <w:r>
-        <w:rPr>
-          <w:rFonts w:ascii="Calibri" w:hAnsi="Calibri"/>
-          <w:b w:val="0"/>
-          <w:i w:val="0"/>
-          <w:color w:val="17324D"/>
-          <w:sz w:val="22"/>
-        </w:rPr>
-        <w:t>Stable controlled identities carry immutable numbered revisions. Returns retain history; corrections create successors rather than overwriting approved facts.</w:t>
+        <w:t>5  Traceability, operation, and boundaries</w:t>
       </w:r>
     </w:p>
     <w:p>
       <w:pPr>
-        <w:keepNext w:val="0"/>
-        <w:spacing w:before="0" w:after="100" w:line="264" w:lineRule="auto"/>
+        <w:spacing w:after="80" w:line="250" w:lineRule="auto"/>
       </w:pPr>
       <w:r>
-        <w:rPr>
-          <w:rFonts w:ascii="Calibri" w:hAnsi="Calibri"/>
-          <w:b/>
-          <w:i w:val="0"/>
-          <w:color w:val="2E74B5"/>
-          <w:sz w:val="22"/>
-        </w:rPr>
-        <w:t xml:space="preserve">Build configuration  </w:t>
-      </w:r>
-      <w:r>
-        <w:rPr>
-          <w:rFonts w:ascii="Calibri" w:hAnsi="Calibri"/>
-          <w:b w:val="0"/>
-          <w:i w:val="0"/>
-          <w:color w:val="17324D"/>
-          <w:sz w:val="22"/>
-        </w:rPr>
-        <w:t>Candidate baselines select exact approved requirement revisions. Software-build and release records identify the immutable configuration that verification and release decisions address.</w:t>
+        <w:t>Digital Thread follows exact build-selected SYSR, HLR, LLR, procedure, execution/result, checksummed evidence, and software-build records. GitLab remains authoritative for implementation code; AeroLink stores immutable links from exact approved LLR revisions to GitLab merge requests and merge commit SHAs, or a justified no-code decision.</w:t>
       </w:r>
     </w:p>
     <w:p>
       <w:pPr>
-        <w:keepNext w:val="0"/>
-        <w:spacing w:before="0" w:after="100" w:line="264" w:lineRule="auto"/>
+        <w:spacing w:after="80" w:line="250" w:lineRule="auto"/>
       </w:pPr>
       <w:r>
-        <w:rPr>
-          <w:rFonts w:ascii="Calibri" w:hAnsi="Calibri"/>
-          <w:b/>
-          <w:i w:val="0"/>
-          <w:color w:val="2E74B5"/>
-          <w:sz w:val="22"/>
-        </w:rPr>
-        <w:t xml:space="preserve">Documents and evidence  </w:t>
-      </w:r>
-      <w:r>
-        <w:rPr>
-          <w:rFonts w:ascii="Calibri" w:hAnsi="Calibri"/>
-          <w:b w:val="0"/>
-          <w:i w:val="0"/>
-          <w:color w:val="17324D"/>
-          <w:sz w:val="22"/>
-        </w:rPr>
-        <w:t>Generated DOCX/PDF outputs and release packages record source baseline, template revision, content hashes, procedures, executions, and evidence references.</w:t>
+        <w:t>The PostgreSQL database, controlled evidence store, and runtime configuration are backed up together into integrity-manifested archives. A daily Windows task can run the same backup engine; restore validation is isolated. Quality gates cover domain/API suites, client lint/type-check/build, browser workflows, PostgreSQL migrations, production hosting, Windows launchers, and exact-merge requalification.</w:t>
       </w:r>
     </w:p>
-    <w:p>
-      <w:pPr>
-        <w:pStyle w:val="Heading1"/>
-      </w:pPr>
-      <w:r>
-        <w:t>5. Traceability and external authorities</w:t>
-      </w:r>
-    </w:p>
-    <w:p>
-      <w:pPr>
-        <w:keepNext w:val="0"/>
-        <w:spacing w:before="0" w:after="140" w:line="264" w:lineRule="auto"/>
-      </w:pPr>
-      <w:r>
-        <w:rPr>
-          <w:rFonts w:ascii="Calibri" w:hAnsi="Calibri"/>
-          <w:b w:val="0"/>
-          <w:i w:val="0"/>
-          <w:color w:val="17324D"/>
-          <w:sz w:val="22"/>
-        </w:rPr>
-        <w:t>Digital Thread follows exact baseline revisions through SYSR → HLR → LLR → procedure → execution/result → evidence → software build. When several procedures cover an exact requirement, it prefers a build-scoped result with linked checksummed evidence; an external text reference remains context, not proof of an attached file.</w:t>
-      </w:r>
-    </w:p>
-    <w:p>
-      <w:pPr>
-        <w:keepNext w:val="0"/>
-        <w:spacing w:before="0" w:after="140" w:line="264" w:lineRule="auto"/>
-      </w:pPr>
-      <w:r>
-        <w:rPr>
-          <w:rFonts w:ascii="Calibri" w:hAnsi="Calibri"/>
-          <w:b w:val="0"/>
-          <w:i w:val="0"/>
-          <w:color w:val="17324D"/>
-          <w:sz w:val="22"/>
-        </w:rPr>
-        <w:t>GitLab remains authoritative for repositories, source, merge requests, review, CI, and commit content. AeroLink records an immutable pointer from an exact approved LLR revision to a GitLab MR and merge commit SHA, or a justified No code change required decision. The same exact-LLR scope drives the Code workspace, release gate, and signed review manifest; AeroLink does not host or review code.</w:t>
-      </w:r>
-    </w:p>
-    <w:p>
-      <w:pPr>
-        <w:pStyle w:val="Heading1"/>
-      </w:pPr>
-      <w:r>
-        <w:t>6. Identity, review, and electronic signatures</w:t>
-      </w:r>
-    </w:p>
-    <w:p>
-      <w:pPr>
-        <w:keepNext w:val="0"/>
-        <w:spacing w:before="0" w:after="140" w:line="264" w:lineRule="auto"/>
-      </w:pPr>
-      <w:r>
-        <w:rPr>
-          <w:rFonts w:ascii="Calibri" w:hAnsi="Calibri"/>
-          <w:b w:val="0"/>
-          <w:i w:val="0"/>
-          <w:color w:val="17324D"/>
-          <w:sz w:val="22"/>
-        </w:rPr>
-        <w:t>Authentication uses revocable server sessions, password hashing, Program membership, roles, and time-bounded delegations. Material approvals use password confirmation and retain signer identity, authority, time, and signed content context. Authors cannot independently approve controlled work where role separation is required; returned work retains its prior rationale and review history.</w:t>
-      </w:r>
-    </w:p>
-    <w:p>
-      <w:pPr>
-        <w:pStyle w:val="Heading1"/>
-      </w:pPr>
-      <w:r>
-        <w:t>7. Backup, recovery, and qualification</w:t>
-      </w:r>
-    </w:p>
-    <w:p>
-      <w:pPr>
-        <w:keepNext w:val="0"/>
-        <w:spacing w:before="0" w:after="140" w:line="264" w:lineRule="auto"/>
-      </w:pPr>
-      <w:r>
-        <w:rPr>
-          <w:rFonts w:ascii="Calibri" w:hAnsi="Calibri"/>
-          <w:b w:val="0"/>
-          <w:i w:val="0"/>
-          <w:color w:val="17324D"/>
-          <w:sz w:val="22"/>
-        </w:rPr>
-        <w:t>The persistent PostgreSQL database, controlled evidence store, and runtime configuration are backed up together into integrity-manifested archives. A Windows scheduled task runs the same verified engine daily by default; schedule and retention can evolve. Restore validation is isolated so it cannot replace the live database accidentally.</w:t>
-      </w:r>
-    </w:p>
-    <w:p>
-      <w:pPr>
-        <w:keepNext w:val="0"/>
-        <w:spacing w:before="0" w:after="140" w:line="264" w:lineRule="auto"/>
-      </w:pPr>
-      <w:r>
-        <w:rPr>
-          <w:rFonts w:ascii="Calibri" w:hAnsi="Calibri"/>
-          <w:b w:val="0"/>
-          <w:i w:val="0"/>
-          <w:color w:val="17324D"/>
-          <w:sz w:val="22"/>
-        </w:rPr>
-        <w:t>Quality gates include domain and API suites, client lint/type-check/build, Playwright role and workflow journeys, production hosting tests, PostgreSQL bootstrap/migration validation, and exact-merge requalification. The FMS records are explicitly demonstration data; demo seeding and accounts are disabled by production configuration.</w:t>
-      </w:r>
-    </w:p>
-    <w:p>
-      <w:pPr>
-        <w:pStyle w:val="Heading1"/>
-      </w:pPr>
-      <w:r>
-        <w:t>8. Deliberate boundaries</w:t>
-      </w:r>
-    </w:p>
-    <w:p>
-      <w:pPr>
-        <w:keepNext w:val="0"/>
-        <w:spacing w:before="0" w:after="0" w:line="264" w:lineRule="auto"/>
-      </w:pPr>
-      <w:r>
-        <w:rPr>
-          <w:rFonts w:ascii="Calibri" w:hAnsi="Calibri"/>
-          <w:b w:val="0"/>
-          <w:i w:val="0"/>
-          <w:color w:val="17324D"/>
-          <w:sz w:val="22"/>
-        </w:rPr>
-        <w:t>AeroLink governs lifecycle data and evidence. It does not execute tests, host source code, approve GitLab merges, claim certification, or replace organizational process authority. External test systems and GitLab remain authoritative for execution and code; AeroLink connects their evidence to the exact controlled revisions and build used for a release decision.</w:t>
-      </w:r>
-    </w:p>
+    <w:tbl>
+      <w:tblPr>
+        <w:tblW w:type="auto" w:w="0"/>
+        <w:tblLook w:firstColumn="1" w:firstRow="1" w:lastColumn="0" w:lastRow="0" w:noHBand="0" w:noVBand="1" w:val="04A0"/>
+      </w:tblPr>
+      <w:tblGrid>
+        <w:gridCol w:w="10282"/>
+      </w:tblGrid>
+      <w:tr>
+        <w:tc>
+          <w:tcPr>
+            <w:tcW w:type="dxa" w:w="10282"/>
+            <w:shd w:fill="FFF6D9"/>
+          </w:tcPr>
+          <w:p>
+            <w:r>
+              <w:rPr>
+                <w:b/>
+                <w:color w:val="102A43"/>
+              </w:rPr>
+              <w:t xml:space="preserve">Boundary: </w:t>
+            </w:r>
+            <w:r>
+              <w:t>AeroLink governs lifecycle data and evidence. It does not execute tests, host source code, replace Microsoft Word, approve GitLab merges, claim certification, or replace organizational process authority.</w:t>
+            </w:r>
+          </w:p>
+        </w:tc>
+      </w:tr>
+    </w:tbl>
     <w:sectPr>
-      <w:headerReference w:type="default" r:id="rId9"/>
-      <w:footerReference w:type="default" r:id="rId10"/>
+      <w:headerReference w:type="default" r:id="rId11"/>
+      <w:footerReference w:type="default" r:id="rId12"/>
       <w:pgSz w:w="12240" w:h="15840"/>
-      <w:pgMar w:top="1080" w:right="1181" w:bottom="1037" w:left="1181" w:header="576" w:footer="576" w:gutter="0"/>
+      <w:pgMar w:top="835" w:right="979" w:bottom="792" w:left="979" w:header="720" w:footer="720" w:gutter="0"/>
       <w:cols w:space="720"/>
       <w:docGrid w:linePitch="360"/>
     </w:sectPr>
@@ -569,19 +611,33 @@
   <w:p>
     <w:pPr>
       <w:pStyle w:val="Footer"/>
-      <w:jc w:val="right"/>
+      <w:jc w:val="center"/>
     </w:pPr>
     <w:r>
       <w:rPr>
-        <w:rFonts w:ascii="Calibri" w:hAnsi="Calibri"/>
-        <w:b w:val="0"/>
-        <w:i w:val="0"/>
-        <w:color w:val="5C6C7E"/>
-        <w:sz w:val="17"/>
-      </w:rPr>
-      <w:t xml:space="preserve">AeroLink • 2 August 2026 • Page </w:t>
+        <w:color w:val="526274"/>
+        <w:sz w:val="15"/>
+      </w:rPr>
+      <w:t>Current implementation brief  |  6 August 2026  |  Controlled project handoff</w:t>
     </w:r>
-    <w:fldSimple w:instr="PAGE"/>
+  </w:p>
+</w:ftr>
+</file>
+
+<file path=word/footer2.xml><?xml version="1.0" encoding="utf-8"?>
+<w:ftr xmlns:m="http://schemas.openxmlformats.org/officeDocument/2006/math" xmlns:mc="http://schemas.openxmlformats.org/markup-compatibility/2006" xmlns:mo="http://schemas.microsoft.com/office/mac/office/2008/main" xmlns:mv="urn:schemas-microsoft-com:mac:vml" xmlns:o="urn:schemas-microsoft-com:office:office" xmlns:r="http://schemas.openxmlformats.org/officeDocument/2006/relationships" xmlns:v="urn:schemas-microsoft-com:vml" xmlns:w10="urn:schemas-microsoft-com:office:word" xmlns:w14="http://schemas.microsoft.com/office/word/2010/wordml" xmlns:w="http://schemas.openxmlformats.org/wordprocessingml/2006/main" xmlns:wne="http://schemas.microsoft.com/office/word/2006/wordml" xmlns:wp14="http://schemas.microsoft.com/office/word/2010/wordprocessingDrawing" xmlns:wp="http://schemas.openxmlformats.org/drawingml/2006/wordprocessingDrawing" xmlns:wpc="http://schemas.microsoft.com/office/word/2010/wordprocessingCanvas" xmlns:wpg="http://schemas.microsoft.com/office/word/2010/wordprocessingGroup" xmlns:wpi="http://schemas.microsoft.com/office/word/2010/wordprocessingInk" xmlns:wps="http://schemas.microsoft.com/office/word/2010/wordprocessingShape" mc:Ignorable="w14 wp14">
+  <w:p>
+    <w:pPr>
+      <w:pStyle w:val="Footer"/>
+      <w:jc w:val="center"/>
+    </w:pPr>
+    <w:r>
+      <w:rPr>
+        <w:color w:val="526274"/>
+        <w:sz w:val="15"/>
+      </w:rPr>
+      <w:t>Current implementation brief  |  6 August 2026  |  Controlled project handoff</w:t>
+    </w:r>
   </w:p>
 </w:ftr>
 </file>
@@ -591,25 +647,42 @@
   <w:p>
     <w:pPr>
       <w:pStyle w:val="Header"/>
-      <w:tabs>
-        <w:tab w:pos="9072" w:val="left"/>
-      </w:tabs>
-      <w:spacing w:after="60"/>
+      <w:jc w:val="right"/>
       <w:pBdr>
-        <w:bottom w:val="single" w:sz="6" w:space="4" w:color="D5DEE8"/>
+        <w:bottom w:val="single" w:sz="8" w:space="6" w:color="168578"/>
       </w:pBdr>
     </w:pPr>
     <w:r>
       <w:rPr>
-        <w:rFonts w:ascii="Calibri" w:hAnsi="Calibri"/>
-        <w:b/>
-        <w:i w:val="0"/>
-        <w:color w:val="5C6C7E"/>
-        <w:sz w:val="17"/>
-      </w:rPr>
-      <w:t>AEROLINK TECHNICAL BRIEF</w:t>
-      <w:tab/>
-      <w:t>CURRENT IMPLEMENTATION</w:t>
+        <w:rFonts w:ascii="Aptos Display" w:hAnsi="Aptos Display"/>
+        <w:b/>
+        <w:color w:val="168578"/>
+        <w:sz w:val="16"/>
+      </w:rPr>
+      <w:t>AEROLINK  /  TECHNICAL OVERVIEW</w:t>
+    </w:r>
+  </w:p>
+</w:hdr>
+</file>
+
+<file path=word/header2.xml><?xml version="1.0" encoding="utf-8"?>
+<w:hdr xmlns:m="http://schemas.openxmlformats.org/officeDocument/2006/math" xmlns:mc="http://schemas.openxmlformats.org/markup-compatibility/2006" xmlns:mo="http://schemas.microsoft.com/office/mac/office/2008/main" xmlns:mv="urn:schemas-microsoft-com:mac:vml" xmlns:o="urn:schemas-microsoft-com:office:office" xmlns:r="http://schemas.openxmlformats.org/officeDocument/2006/relationships" xmlns:v="urn:schemas-microsoft-com:vml" xmlns:w10="urn:schemas-microsoft-com:office:word" xmlns:w14="http://schemas.microsoft.com/office/word/2010/wordml" xmlns:w="http://schemas.openxmlformats.org/wordprocessingml/2006/main" xmlns:wne="http://schemas.microsoft.com/office/word/2006/wordml" xmlns:wp14="http://schemas.microsoft.com/office/word/2010/wordprocessingDrawing" xmlns:wp="http://schemas.openxmlformats.org/drawingml/2006/wordprocessingDrawing" xmlns:wpc="http://schemas.microsoft.com/office/word/2010/wordprocessingCanvas" xmlns:wpg="http://schemas.microsoft.com/office/word/2010/wordprocessingGroup" xmlns:wpi="http://schemas.microsoft.com/office/word/2010/wordprocessingInk" xmlns:wps="http://schemas.microsoft.com/office/word/2010/wordprocessingShape" mc:Ignorable="w14 wp14">
+  <w:p>
+    <w:pPr>
+      <w:pStyle w:val="Header"/>
+      <w:jc w:val="right"/>
+      <w:pBdr>
+        <w:bottom w:val="single" w:sz="8" w:space="6" w:color="168578"/>
+      </w:pBdr>
+    </w:pPr>
+    <w:r>
+      <w:rPr>
+        <w:rFonts w:ascii="Aptos Display" w:hAnsi="Aptos Display"/>
+        <w:b/>
+        <w:color w:val="168578"/>
+        <w:sz w:val="16"/>
+      </w:rPr>
+      <w:t>AEROLINK  /  TECHNICAL OVERVIEW</w:t>
     </w:r>
   </w:p>
 </w:hdr>
@@ -979,12 +1052,12 @@
     <w:qFormat/>
     <w:rsid w:val="00FC693F"/>
     <w:pPr>
-      <w:spacing w:after="120" w:line="264" w:lineRule="auto"/>
+      <w:spacing w:after="60"/>
     </w:pPr>
     <w:rPr>
-      <w:rFonts w:ascii="Calibri" w:hAnsi="Calibri"/>
-      <w:color w:val="17324D"/>
-      <w:sz w:val="22"/>
+      <w:rFonts w:ascii="Aptos" w:hAnsi="Aptos"/>
+      <w:color w:val="25364D"/>
+      <w:sz w:val="18"/>
     </w:rPr>
   </w:style>
   <w:style w:type="paragraph" w:styleId="Header">
@@ -1042,15 +1115,15 @@
     <w:pPr>
       <w:keepNext/>
       <w:keepLines/>
-      <w:spacing w:before="280" w:after="120"/>
+      <w:spacing w:before="480" w:after="0"/>
       <w:outlineLvl w:val="0"/>
     </w:pPr>
     <w:rPr>
-      <w:rFonts w:asciiTheme="majorHAnsi" w:eastAsiaTheme="majorEastAsia" w:hAnsiTheme="majorHAnsi" w:cstheme="majorBidi" w:ascii="Calibri" w:hAnsi="Calibri"/>
+      <w:rFonts w:asciiTheme="majorHAnsi" w:eastAsiaTheme="majorEastAsia" w:hAnsiTheme="majorHAnsi" w:cstheme="majorBidi"/>
       <w:b/>
       <w:bCs/>
-      <w:color w:val="2E74B5"/>
-      <w:sz w:val="32"/>
+      <w:color w:val="365F91" w:themeColor="accent1" w:themeShade="BF"/>
+      <w:sz w:val="28"/>
       <w:szCs w:val="28"/>
     </w:rPr>
   </w:style>
@@ -1066,14 +1139,14 @@
     <w:pPr>
       <w:keepNext/>
       <w:keepLines/>
-      <w:spacing w:before="200" w:after="100"/>
+      <w:spacing w:before="200" w:after="0"/>
       <w:outlineLvl w:val="1"/>
     </w:pPr>
     <w:rPr>
-      <w:rFonts w:asciiTheme="majorHAnsi" w:eastAsiaTheme="majorEastAsia" w:hAnsiTheme="majorHAnsi" w:cstheme="majorBidi" w:ascii="Calibri" w:hAnsi="Calibri"/>
+      <w:rFonts w:asciiTheme="majorHAnsi" w:eastAsiaTheme="majorEastAsia" w:hAnsiTheme="majorHAnsi" w:cstheme="majorBidi"/>
       <w:b/>
       <w:bCs/>
-      <w:color w:val="2E74B5"/>
+      <w:color w:val="4F81BD" w:themeColor="accent1"/>
       <w:sz w:val="26"/>
       <w:szCs w:val="26"/>
     </w:rPr>
@@ -1090,15 +1163,14 @@
     <w:pPr>
       <w:keepNext/>
       <w:keepLines/>
-      <w:spacing w:before="160" w:after="80"/>
+      <w:spacing w:before="200" w:after="0"/>
       <w:outlineLvl w:val="2"/>
     </w:pPr>
     <w:rPr>
-      <w:rFonts w:asciiTheme="majorHAnsi" w:eastAsiaTheme="majorEastAsia" w:hAnsiTheme="majorHAnsi" w:cstheme="majorBidi" w:ascii="Calibri" w:hAnsi="Calibri"/>
+      <w:rFonts w:asciiTheme="majorHAnsi" w:eastAsiaTheme="majorEastAsia" w:hAnsiTheme="majorHAnsi" w:cstheme="majorBidi"/>
       <w:b/>
       <w:bCs/>
-      <w:color w:val="17324D"/>
-      <w:sz w:val="24"/>
+      <w:color w:val="4F81BD" w:themeColor="accent1"/>
     </w:rPr>
   </w:style>
   <w:style w:type="paragraph" w:styleId="Heading4">
@@ -1516,6 +1588,11 @@
       </w:numPr>
       <w:contextualSpacing/>
     </w:pPr>
+    <w:rPr>
+      <w:rFonts w:ascii="Aptos" w:hAnsi="Aptos"/>
+      <w:color w:val="25364D"/>
+      <w:sz w:val="17"/>
+    </w:rPr>
   </w:style>
   <w:style w:type="paragraph" w:styleId="ListBullet2">
     <w:name w:val="List Bullet 2"/>

</xml_diff>

<commit_message>
Add controlled Word Documentation Center (#355)
* Add controlled Word Documentation Center

* Allow connector builds on Linux CI
</commit_message>
<xml_diff>
--- a/docs/AeroLink Technical Overview.docx
+++ b/docs/AeroLink Technical Overview.docx
@@ -4,559 +4,601 @@
   <w:body>
     <w:p>
       <w:pPr>
-        <w:keepNext/>
-        <w:spacing w:before="200" w:after="40" w:line="264" w:lineRule="auto"/>
+        <w:spacing w:before="100" w:after="20"/>
       </w:pPr>
       <w:r>
         <w:rPr>
-          <w:rFonts w:ascii="Calibri" w:hAnsi="Calibri"/>
+          <w:rFonts w:ascii="Aptos Display" w:hAnsi="Aptos Display"/>
           <w:b/>
-          <w:i w:val="0"/>
-          <w:color w:val="17324D"/>
-          <w:sz w:val="46"/>
+          <w:color w:val="102A43"/>
+          <w:sz w:val="56"/>
         </w:rPr>
-        <w:t>AeroLink Technical Overview</w:t>
+        <w:t>AeroLink</w:t>
       </w:r>
     </w:p>
     <w:p>
       <w:pPr>
-        <w:keepNext/>
-        <w:spacing w:before="0" w:after="240" w:line="264" w:lineRule="auto"/>
+        <w:spacing w:after="100"/>
         <w:pBdr>
-          <w:bottom w:val="single" w:sz="18" w:space="10" w:color="2E74B5"/>
+          <w:bottom w:val="single" w:sz="18" w:space="6" w:color="168578"/>
         </w:pBdr>
       </w:pPr>
       <w:r>
         <w:rPr>
-          <w:rFonts w:ascii="Calibri" w:hAnsi="Calibri"/>
-          <w:b w:val="0"/>
-          <w:i w:val="0"/>
-          <w:color w:val="5C6C7E"/>
-          <w:sz w:val="25"/>
+          <w:b/>
+          <w:color w:val="168578"/>
+          <w:sz w:val="26"/>
         </w:rPr>
-        <w:t>Architecture, data, version control, and operational assurance</w:t>
+        <w:t>How the platform, database, version control, and Word document lifecycle work</w:t>
       </w:r>
     </w:p>
     <w:p>
       <w:pPr>
-        <w:keepNext w:val="0"/>
-        <w:spacing w:before="0" w:after="40" w:line="264" w:lineRule="auto"/>
+        <w:spacing w:after="140"/>
       </w:pPr>
       <w:r>
         <w:rPr>
-          <w:rFonts w:ascii="Calibri" w:hAnsi="Calibri"/>
           <w:b/>
-          <w:i w:val="0"/>
-          <w:color w:val="2E74B5"/>
-          <w:sz w:val="22"/>
+          <w:color w:val="526274"/>
+          <w:sz w:val="15"/>
         </w:rPr>
-        <w:t xml:space="preserve">Audience  </w:t>
-      </w:r>
-      <w:r>
-        <w:rPr>
-          <w:rFonts w:ascii="Calibri" w:hAnsi="Calibri"/>
-          <w:b w:val="0"/>
-          <w:i w:val="0"/>
-          <w:color w:val="17324D"/>
-          <w:sz w:val="22"/>
-        </w:rPr>
-        <w:t>Software, systems, verification, configuration-management, and IT colleagues</w:t>
+        <w:t>FOR SOFTWARE, SYSTEMS, VERIFICATION, CONFIGURATION-MANAGEMENT, AND IT COLLEAGUES</w:t>
       </w:r>
     </w:p>
     <w:p>
       <w:pPr>
-        <w:keepNext w:val="0"/>
-        <w:spacing w:before="0" w:after="200" w:line="264" w:lineRule="auto"/>
+        <w:spacing w:before="160" w:after="60"/>
       </w:pPr>
       <w:r>
         <w:rPr>
-          <w:rFonts w:ascii="Calibri" w:hAnsi="Calibri"/>
           <w:b/>
-          <w:i w:val="0"/>
           <w:color w:val="2E74B5"/>
-          <w:sz w:val="22"/>
+          <w:sz w:val="26"/>
         </w:rPr>
-        <w:t xml:space="preserve">Scope  </w:t>
-      </w:r>
-      <w:r>
-        <w:rPr>
-          <w:rFonts w:ascii="Calibri" w:hAnsi="Calibri"/>
-          <w:b w:val="0"/>
-          <w:i w:val="0"/>
-          <w:color w:val="17324D"/>
-          <w:sz w:val="22"/>
-        </w:rPr>
-        <w:t>Current implementation; concise companion to the authoritative repository documents</w:t>
+        <w:t>1  System shape</w:t>
       </w:r>
     </w:p>
     <w:p>
       <w:pPr>
-        <w:pStyle w:val="Heading1"/>
+        <w:spacing w:after="80" w:line="250" w:lineRule="auto"/>
       </w:pPr>
       <w:r>
-        <w:t>1. System shape</w:t>
+        <w:t>AeroLink is a local/on-premises modular monolith. A React and TypeScript browser client calls an ASP.NET Core API on .NET 10. Entity Framework Core maps controlled domain records to PostgreSQL. SQLite is used only for isolated automated tests. The production-shaped launcher builds the client and serves browser and API traffic from one origin; development uses a Vite client beside the API.</w:t>
       </w:r>
     </w:p>
     <w:p>
       <w:pPr>
-        <w:keepNext w:val="0"/>
-        <w:spacing w:before="0" w:after="140" w:line="264" w:lineRule="auto"/>
+        <w:spacing w:after="80" w:line="250" w:lineRule="auto"/>
+      </w:pPr>
+      <w:r>
+        <w:t>Lifecycle rules live in domain objects, not in presentation code. The API authenticates the caller, verifies Project/build context and role authority, executes one domain operation, and persists its resulting state plus audit or signature evidence. Released-build mutation guards and independent-review rules are therefore enforced even when a client request is crafted manually.</w:t>
+      </w:r>
+    </w:p>
+    <w:tbl>
+      <w:tblPr>
+        <w:tblW w:type="auto" w:w="0"/>
+        <w:tblLayout w:type="fixed"/>
+        <w:tblLook w:firstColumn="1" w:firstRow="1" w:lastColumn="0" w:lastRow="0" w:noHBand="0" w:noVBand="1" w:val="04A0"/>
+      </w:tblPr>
+      <w:tblGrid>
+        <w:gridCol w:w="3427"/>
+        <w:gridCol w:w="3427"/>
+        <w:gridCol w:w="3427"/>
+      </w:tblGrid>
+      <w:tr>
+        <w:tc>
+          <w:tcPr>
+            <w:tcW w:type="dxa" w:w="2952"/>
+            <w:shd w:fill="102A43"/>
+            <w:vAlign w:val="center"/>
+          </w:tcPr>
+          <w:p>
+            <w:r>
+              <w:rPr>
+                <w:b/>
+                <w:color w:val="FFFFFF"/>
+              </w:rPr>
+              <w:t>Browser</w:t>
+            </w:r>
+          </w:p>
+        </w:tc>
+        <w:tc>
+          <w:tcPr>
+            <w:tcW w:type="dxa" w:w="2952"/>
+            <w:shd w:fill="102A43"/>
+            <w:vAlign w:val="center"/>
+          </w:tcPr>
+          <w:p>
+            <w:r>
+              <w:rPr>
+                <w:b/>
+                <w:color w:val="FFFFFF"/>
+              </w:rPr>
+              <w:t>Application</w:t>
+            </w:r>
+          </w:p>
+        </w:tc>
+        <w:tc>
+          <w:tcPr>
+            <w:tcW w:type="dxa" w:w="3960"/>
+            <w:shd w:fill="102A43"/>
+            <w:vAlign w:val="center"/>
+          </w:tcPr>
+          <w:p>
+            <w:r>
+              <w:rPr>
+                <w:b/>
+                <w:color w:val="FFFFFF"/>
+              </w:rPr>
+              <w:t>Controlled data</w:t>
+            </w:r>
+          </w:p>
+        </w:tc>
+      </w:tr>
+      <w:tr>
+        <w:tc>
+          <w:tcPr>
+            <w:tcW w:type="dxa" w:w="2952"/>
+            <w:shd w:fill="EAF2F5"/>
+          </w:tcPr>
+          <w:p>
+            <w:r>
+              <w:t>React / TypeScript</w:t>
+            </w:r>
+          </w:p>
+        </w:tc>
+        <w:tc>
+          <w:tcPr>
+            <w:tcW w:type="dxa" w:w="2952"/>
+            <w:shd w:fill="EAF2F5"/>
+          </w:tcPr>
+          <w:p>
+            <w:r>
+              <w:t>.NET API + domain rules</w:t>
+            </w:r>
+          </w:p>
+        </w:tc>
+        <w:tc>
+          <w:tcPr>
+            <w:tcW w:type="dxa" w:w="3960"/>
+            <w:shd w:fill="EAF2F5"/>
+          </w:tcPr>
+          <w:p>
+            <w:r>
+              <w:t>PostgreSQL metadata</w:t>
+            </w:r>
+          </w:p>
+        </w:tc>
+      </w:tr>
+      <w:tr>
+        <w:tc>
+          <w:tcPr>
+            <w:tcW w:type="dxa" w:w="2952"/>
+            <w:shd w:fill="FFFFFF"/>
+          </w:tcPr>
+          <w:p>
+            <w:r>
+              <w:t>Build-scoped routes</w:t>
+            </w:r>
+          </w:p>
+        </w:tc>
+        <w:tc>
+          <w:tcPr>
+            <w:tcW w:type="dxa" w:w="2952"/>
+            <w:shd w:fill="FFFFFF"/>
+          </w:tcPr>
+          <w:p>
+            <w:r>
+              <w:t>EF Core migrations</w:t>
+            </w:r>
+          </w:p>
+        </w:tc>
+        <w:tc>
+          <w:tcPr>
+            <w:tcW w:type="dxa" w:w="3960"/>
+            <w:shd w:fill="FFFFFF"/>
+          </w:tcPr>
+          <w:p>
+            <w:r>
+              <w:t>Checksummed evidence store</w:t>
+            </w:r>
+          </w:p>
+        </w:tc>
+      </w:tr>
+      <w:tr>
+        <w:tc>
+          <w:tcPr>
+            <w:tcW w:type="dxa" w:w="2952"/>
+            <w:shd w:fill="EAF2F5"/>
+          </w:tcPr>
+          <w:p>
+            <w:r>
+              <w:t>Explanatory UI</w:t>
+            </w:r>
+          </w:p>
+        </w:tc>
+        <w:tc>
+          <w:tcPr>
+            <w:tcW w:type="dxa" w:w="2952"/>
+            <w:shd w:fill="EAF2F5"/>
+          </w:tcPr>
+          <w:p>
+            <w:r>
+              <w:t>Authorization + audit</w:t>
+            </w:r>
+          </w:p>
+        </w:tc>
+        <w:tc>
+          <w:tcPr>
+            <w:tcW w:type="dxa" w:w="3960"/>
+            <w:shd w:fill="EAF2F5"/>
+          </w:tcPr>
+          <w:p>
+            <w:r>
+              <w:t>Immutable selections and files</w:t>
+            </w:r>
+          </w:p>
+        </w:tc>
+      </w:tr>
+    </w:tbl>
+    <w:p>
+      <w:pPr>
+        <w:spacing w:before="160" w:after="60"/>
       </w:pPr>
       <w:r>
         <w:rPr>
-          <w:rFonts w:ascii="Calibri" w:hAnsi="Calibri"/>
-          <w:b w:val="0"/>
-          <w:i w:val="0"/>
-          <w:color w:val="17324D"/>
-          <w:sz w:val="22"/>
+          <w:b/>
+          <w:color w:val="2E74B5"/>
+          <w:sz w:val="26"/>
         </w:rPr>
-        <w:t>AeroLink is a modular monolith: a React/TypeScript browser client calls an ASP.NET Core API on .NET 10. Entity Framework Core provides persistence. PostgreSQL is the normal local/on-premises database; SQLite is used only for isolated automated tests. The production-shaped launcher serves the built client and API from one origin, while development uses Vite plus the API.</w:t>
+        <w:t>2  Database and controlled records</w:t>
       </w:r>
     </w:p>
     <w:p>
       <w:pPr>
-        <w:keepNext w:val="0"/>
-        <w:spacing w:before="0" w:after="140" w:line="264" w:lineRule="auto"/>
+        <w:spacing w:after="80" w:line="250" w:lineRule="auto"/>
       </w:pPr>
       <w:r>
-        <w:rPr>
-          <w:rFonts w:ascii="Calibri" w:hAnsi="Calibri"/>
-          <w:b w:val="0"/>
-          <w:i w:val="0"/>
-          <w:color w:val="17324D"/>
-          <w:sz w:val="22"/>
-        </w:rPr>
-        <w:t>Lifecycle rules live in domain objects. Endpoints authenticate the caller, validate Project/build scope and role authority, invoke the domain operation, and persist state plus audit or integration evidence atomically. The browser explains state, but it is not the control boundary: released-build mutation protection and role separation are enforced server-side.</w:t>
+        <w:t>PostgreSQL is the one real-life database. EF Core migrations version the schema and run at application startup; migrations add or transform structures without resetting persistent engineering records. Stable identities such as SRCR-00076, LLR-000008, or SDP-000001 remain separate from immutable formal revisions such as .00 and .01.</w:t>
       </w:r>
     </w:p>
     <w:p>
       <w:pPr>
-        <w:pStyle w:val="Heading1"/>
+        <w:pStyle w:val="ListBullet"/>
+        <w:spacing w:after="40"/>
       </w:pPr>
       <w:r>
-        <w:t>2. Request and transaction path</w:t>
+        <w:t>Requirements: a change request proposes a new exact revision; ordered review and electronic signatures approve the snapshot; a build baseline selects exact revision IDs.</w:t>
       </w:r>
     </w:p>
     <w:p>
       <w:pPr>
-        <w:keepNext w:val="0"/>
-        <w:spacing w:before="0" w:after="100" w:line="264" w:lineRule="auto"/>
+        <w:pStyle w:val="ListBullet"/>
+        <w:spacing w:after="40"/>
       </w:pPr>
       <w:r>
-        <w:rPr>
-          <w:rFonts w:ascii="Calibri" w:hAnsi="Calibri"/>
-          <w:b/>
-          <w:i w:val="0"/>
-          <w:color w:val="2E74B5"/>
-          <w:sz w:val="22"/>
-        </w:rPr>
-        <w:t xml:space="preserve">1 • Client  </w:t>
-      </w:r>
-      <w:r>
-        <w:rPr>
-          <w:rFonts w:ascii="Calibri" w:hAnsi="Calibri"/>
-          <w:b w:val="0"/>
-          <w:i w:val="0"/>
-          <w:color w:val="17324D"/>
-          <w:sz w:val="22"/>
-        </w:rPr>
-        <w:t>Sends an authenticated request carrying the deep-linked Program, Project, build, and artifact context.</w:t>
+        <w:t>Verification: procedures, executions, results, and evidence are separate controlled records joined to exact revisions and builds.</w:t>
       </w:r>
     </w:p>
     <w:p>
       <w:pPr>
-        <w:keepNext w:val="0"/>
-        <w:spacing w:before="0" w:after="100" w:line="264" w:lineRule="auto"/>
+        <w:pStyle w:val="ListBullet"/>
+        <w:spacing w:after="40"/>
       </w:pPr>
       <w:r>
-        <w:rPr>
-          <w:rFonts w:ascii="Calibri" w:hAnsi="Calibri"/>
-          <w:b/>
-          <w:i w:val="0"/>
-          <w:color w:val="2E74B5"/>
-          <w:sz w:val="22"/>
-        </w:rPr>
-        <w:t xml:space="preserve">2 • API  </w:t>
-      </w:r>
-      <w:r>
-        <w:rPr>
-          <w:rFonts w:ascii="Calibri" w:hAnsi="Calibri"/>
-          <w:b w:val="0"/>
-          <w:i w:val="0"/>
-          <w:color w:val="17324D"/>
-          <w:sz w:val="22"/>
-        </w:rPr>
-        <w:t>Checks session, anti-forgery protection, membership, role, resource ownership, and build isolation.</w:t>
+        <w:t>Managed documents: PostgreSQL holds register identity, formal revision, build selection, review route, signatures, links, locks, and hashes; the evidence store holds DOCX/PDF bytes.</w:t>
       </w:r>
     </w:p>
     <w:p>
       <w:pPr>
-        <w:keepNext w:val="0"/>
-        <w:spacing w:before="0" w:after="100" w:line="264" w:lineRule="auto"/>
+        <w:pStyle w:val="ListBullet"/>
+        <w:spacing w:after="40"/>
       </w:pPr>
       <w:r>
-        <w:rPr>
-          <w:rFonts w:ascii="Calibri" w:hAnsi="Calibri"/>
-          <w:b/>
-          <w:i w:val="0"/>
-          <w:color w:val="2E74B5"/>
-          <w:sz w:val="22"/>
-        </w:rPr>
-        <w:t xml:space="preserve">3 • Domain  </w:t>
-      </w:r>
-      <w:r>
-        <w:rPr>
-          <w:rFonts w:ascii="Calibri" w:hAnsi="Calibri"/>
-          <w:b w:val="0"/>
-          <w:i w:val="0"/>
-          <w:color w:val="17324D"/>
-          <w:sz w:val="22"/>
-        </w:rPr>
-        <w:t>Applies state-machine, independence, revision, rationale, and signature rules.</w:t>
+        <w:t>Integrity: foreign keys, unique constraints, concurrency versions, SHA-256 hashes, append-only events, and server-side build guards protect relationships.</w:t>
       </w:r>
     </w:p>
     <w:p>
       <w:pPr>
-        <w:keepNext w:val="0"/>
-        <w:spacing w:before="0" w:after="100" w:line="264" w:lineRule="auto"/>
+        <w:sectPr>
+          <w:headerReference w:type="default" r:id="rId9"/>
+          <w:footerReference w:type="default" r:id="rId10"/>
+          <w:pgSz w:w="12240" w:h="15840"/>
+          <w:pgMar w:top="835" w:right="979" w:bottom="792" w:left="979" w:header="720" w:footer="720" w:gutter="0"/>
+          <w:cols w:space="720"/>
+          <w:docGrid w:linePitch="360"/>
+        </w:sectPr>
+      </w:pPr>
+    </w:p>
+    <w:p>
+      <w:pPr>
+        <w:spacing w:before="160" w:after="60"/>
       </w:pPr>
       <w:r>
         <w:rPr>
-          <w:rFonts w:ascii="Calibri" w:hAnsi="Calibri"/>
           <w:b/>
-          <w:i w:val="0"/>
           <w:color w:val="2E74B5"/>
-          <w:sz w:val="22"/>
+          <w:sz w:val="26"/>
         </w:rPr>
-        <w:t xml:space="preserve">4 • Persistence  </w:t>
+        <w:t>3  Four complementary version controls</w:t>
       </w:r>
+    </w:p>
+    <w:tbl>
+      <w:tblPr>
+        <w:tblW w:type="auto" w:w="0"/>
+        <w:tblLayout w:type="fixed"/>
+        <w:tblLook w:firstColumn="1" w:firstRow="1" w:lastColumn="0" w:lastRow="0" w:noHBand="0" w:noVBand="1" w:val="04A0"/>
+      </w:tblPr>
+      <w:tblGrid>
+        <w:gridCol w:w="5141"/>
+        <w:gridCol w:w="5141"/>
+      </w:tblGrid>
+      <w:tr>
+        <w:tc>
+          <w:tcPr>
+            <w:tcW w:type="dxa" w:w="5141"/>
+            <w:shd w:fill="102A43"/>
+          </w:tcPr>
+          <w:p>
+            <w:r>
+              <w:rPr>
+                <w:b/>
+                <w:color w:val="FFFFFF"/>
+              </w:rPr>
+              <w:t>Control</w:t>
+            </w:r>
+          </w:p>
+        </w:tc>
+        <w:tc>
+          <w:tcPr>
+            <w:tcW w:type="dxa" w:w="5141"/>
+            <w:shd w:fill="102A43"/>
+          </w:tcPr>
+          <w:p>
+            <w:r>
+              <w:rPr>
+                <w:b/>
+                <w:color w:val="FFFFFF"/>
+              </w:rPr>
+              <w:t>What it fixes in time</w:t>
+            </w:r>
+          </w:p>
+        </w:tc>
+      </w:tr>
+      <w:tr>
+        <w:tc>
+          <w:tcPr>
+            <w:tcW w:type="dxa" w:w="5141"/>
+            <w:shd w:fill="EAF2F5"/>
+          </w:tcPr>
+          <w:p>
+            <w:r>
+              <w:rPr>
+                <w:b/>
+              </w:rPr>
+              <w:t>Git / GitHub</w:t>
+            </w:r>
+          </w:p>
+        </w:tc>
+        <w:tc>
+          <w:tcPr>
+            <w:tcW w:type="dxa" w:w="5141"/>
+          </w:tcPr>
+          <w:p>
+            <w:r>
+              <w:t>Application source and repository documentation; focused branches, pull requests, CI, and reviewed main.</w:t>
+            </w:r>
+          </w:p>
+        </w:tc>
+      </w:tr>
+      <w:tr>
+        <w:tc>
+          <w:tcPr>
+            <w:tcW w:type="dxa" w:w="5141"/>
+            <w:shd w:fill="EAF2F5"/>
+          </w:tcPr>
+          <w:p>
+            <w:r>
+              <w:rPr>
+                <w:b/>
+              </w:rPr>
+              <w:t>Artifact revisions</w:t>
+            </w:r>
+          </w:p>
+        </w:tc>
+        <w:tc>
+          <w:tcPr>
+            <w:tcW w:type="dxa" w:w="5141"/>
+          </w:tcPr>
+          <w:p>
+            <w:r>
+              <w:t>The exact engineering statement, procedure, problem, change, or managed document revision that was reviewed.</w:t>
+            </w:r>
+          </w:p>
+        </w:tc>
+      </w:tr>
+      <w:tr>
+        <w:tc>
+          <w:tcPr>
+            <w:tcW w:type="dxa" w:w="5141"/>
+            <w:shd w:fill="EAF2F5"/>
+          </w:tcPr>
+          <w:p>
+            <w:r>
+              <w:rPr>
+                <w:b/>
+              </w:rPr>
+              <w:t>Build baselines</w:t>
+            </w:r>
+          </w:p>
+        </w:tc>
+        <w:tc>
+          <w:tcPr>
+            <w:tcW w:type="dxa" w:w="5141"/>
+          </w:tcPr>
+          <w:p>
+            <w:r>
+              <w:t>The exact approved requirement and verification configuration selected for Build 1.5, 1.6, or a successor.</w:t>
+            </w:r>
+          </w:p>
+        </w:tc>
+      </w:tr>
+      <w:tr>
+        <w:tc>
+          <w:tcPr>
+            <w:tcW w:type="dxa" w:w="5141"/>
+            <w:shd w:fill="EAF2F5"/>
+          </w:tcPr>
+          <w:p>
+            <w:r>
+              <w:rPr>
+                <w:b/>
+              </w:rPr>
+              <w:t>Files and publications</w:t>
+            </w:r>
+          </w:p>
+        </w:tc>
+        <w:tc>
+          <w:tcPr>
+            <w:tcW w:type="dxa" w:w="5141"/>
+          </w:tcPr>
+          <w:p>
+            <w:r>
+              <w:t>Every working DOCX version, released DOCX/PDF pair, generated publication, and package by source and SHA-256 hash.</w:t>
+            </w:r>
+          </w:p>
+        </w:tc>
+      </w:tr>
+    </w:tbl>
+    <w:p>
+      <w:pPr>
+        <w:spacing w:before="160" w:after="60"/>
+      </w:pPr>
       <w:r>
         <w:rPr>
-          <w:rFonts w:ascii="Calibri" w:hAnsi="Calibri"/>
-          <w:b w:val="0"/>
-          <w:i w:val="0"/>
-          <w:color w:val="17324D"/>
-          <w:sz w:val="22"/>
+          <w:b/>
+          <w:color w:val="2E74B5"/>
+          <w:sz w:val="26"/>
         </w:rPr>
-        <w:t>Writes the controlled record, history, and durable event evidence in one database transaction.</w:t>
+        <w:t>4  Word-authored documentation lifecycle</w:t>
       </w:r>
     </w:p>
     <w:p>
       <w:pPr>
-        <w:keepNext w:val="0"/>
-        <w:spacing w:before="0" w:after="100" w:line="264" w:lineRule="auto"/>
+        <w:spacing w:after="80" w:line="250" w:lineRule="auto"/>
       </w:pPr>
       <w:r>
-        <w:rPr>
-          <w:rFonts w:ascii="Calibri" w:hAnsi="Calibri"/>
-          <w:b/>
-          <w:i w:val="0"/>
-          <w:color w:val="2E74B5"/>
-          <w:sz w:val="22"/>
-        </w:rPr>
-        <w:t xml:space="preserve">5 • Projection  </w:t>
-      </w:r>
-      <w:r>
-        <w:rPr>
-          <w:rFonts w:ascii="Calibri" w:hAnsi="Calibri"/>
-          <w:b w:val="0"/>
-          <w:i w:val="0"/>
-          <w:color w:val="17324D"/>
-          <w:sz w:val="22"/>
-        </w:rPr>
-        <w:t>Returns a permission-safe view; refresh and direct links rebuild the same context from durable identifiers.</w:t>
+        <w:t>Documentation Center deliberately keeps Word as the authoring tool. The per-user Windows connector redeems a one-use scoped grant, downloads the exact current DOCX, opens Microsoft Word, and maintains an exclusive lease. Check-in creates a new immutable working-file version with a required comment; discard closes the checkout without changing the authoritative source. Stale-source check-ins fail rather than overwrite another user's work.</w:t>
       </w:r>
     </w:p>
     <w:p>
       <w:pPr>
-        <w:pStyle w:val="Heading1"/>
+        <w:pStyle w:val="ListBullet"/>
+        <w:spacing w:after="40"/>
       </w:pPr>
       <w:r>
-        <w:t>3. PostgreSQL and controlled records</w:t>
+        <w:t>Draft is a visible lifecycle state, not a separate acronym. Every Draft section must retain a faint Draft watermark.</w:t>
       </w:r>
     </w:p>
     <w:p>
       <w:pPr>
-        <w:keepNext w:val="0"/>
-        <w:spacing w:before="0" w:after="140" w:line="264" w:lineRule="auto"/>
+        <w:pStyle w:val="ListBullet"/>
+        <w:spacing w:after="40"/>
       </w:pPr>
       <w:r>
-        <w:rPr>
-          <w:rFonts w:ascii="Calibri" w:hAnsi="Calibri"/>
-          <w:b w:val="0"/>
-          <w:i w:val="0"/>
-          <w:color w:val="17324D"/>
-          <w:sz w:val="22"/>
-        </w:rPr>
-        <w:t>PostgreSQL is the one real-life database. EF Core migrations version its schema and run at startup. Stable artifacts (for example SCR-00076 or LLR-000008) are separate from immutable revisions (.00, .01). Approved content is never edited in place: a change request proposes a successor, ordered review and electronic signatures approve it, and baseline materialization selects exact revision IDs for a build.</w:t>
+        <w:t>The author, technical reviewer, and final SQA/configuration approver must be different people.</w:t>
       </w:r>
     </w:p>
     <w:p>
       <w:pPr>
-        <w:keepNext w:val="0"/>
-        <w:spacing w:before="0" w:after="0" w:line="264" w:lineRule="auto"/>
+        <w:pStyle w:val="ListBullet"/>
+        <w:spacing w:after="40"/>
       </w:pPr>
       <w:r>
-        <w:rPr>
-          <w:rFonts w:ascii="Calibri" w:hAnsi="Calibri"/>
-          <w:b w:val="0"/>
-          <w:i w:val="0"/>
-          <w:color w:val="17324D"/>
-          <w:sz w:val="22"/>
-        </w:rPr>
-        <w:t>Foreign keys, unique constraints, concurrency tokens, append-only history, hashes, and server-side build guards protect the relationships. Build 1.5 resolves to its released baseline. Build 1.6 inherits that exact baseline until its own candidate is materialized, while its changes, assessments, tests, Problem Reports, and code mappings remain a separate active layer.</w:t>
-      </w:r>
-    </w:p>
-    <w:p>
-      <w:r>
-        <w:br w:type="page"/>
+        <w:t>At final review, Word produces a watermark-free DOCX and PDF labeled Release Candidate. AeroLink rejects any pair still marked Draft, then validates and hashes the exact candidate before release.</w:t>
       </w:r>
     </w:p>
     <w:p>
       <w:pPr>
-        <w:pStyle w:val="Heading1"/>
+        <w:pStyle w:val="ListBullet"/>
+        <w:spacing w:after="40"/>
       </w:pPr>
       <w:r>
-        <w:t>4. Four complementary kinds of version control</w:t>
+        <w:t>Build 1.5 projects only its released selection and is read-only; Build 1.6 can carry that release beside one active successor.</w:t>
       </w:r>
     </w:p>
     <w:p>
       <w:pPr>
-        <w:keepNext w:val="0"/>
-        <w:spacing w:before="0" w:after="100" w:line="264" w:lineRule="auto"/>
+        <w:pStyle w:val="ListBullet"/>
+        <w:spacing w:after="40"/>
       </w:pPr>
       <w:r>
-        <w:rPr>
-          <w:rFonts w:ascii="Calibri" w:hAnsi="Calibri"/>
-          <w:b/>
-          <w:i w:val="0"/>
-          <w:color w:val="2E74B5"/>
-          <w:sz w:val="22"/>
-        </w:rPr>
-        <w:t xml:space="preserve">Application source  </w:t>
-      </w:r>
-      <w:r>
-        <w:rPr>
-          <w:rFonts w:ascii="Calibri" w:hAnsi="Calibri"/>
-          <w:b w:val="0"/>
-          <w:i w:val="0"/>
-          <w:color w:val="17324D"/>
-          <w:sz w:val="22"/>
-        </w:rPr>
-        <w:t>Git and GitHub version code and documentation. Work uses focused codex/* branches, pull requests, CI, and squash merges; implementation is never pushed directly to main.</w:t>
+        <w:t>Links select existing same-Project change requests, Problem Reports, Test Change Requests, and builds and remain attached to the exact document revision.</w:t>
       </w:r>
     </w:p>
     <w:p>
       <w:pPr>
-        <w:keepNext w:val="0"/>
-        <w:spacing w:before="0" w:after="100" w:line="264" w:lineRule="auto"/>
+        <w:spacing w:before="160" w:after="60"/>
       </w:pPr>
       <w:r>
         <w:rPr>
-          <w:rFonts w:ascii="Calibri" w:hAnsi="Calibri"/>
           <w:b/>
-          <w:i w:val="0"/>
           <w:color w:val="2E74B5"/>
-          <w:sz w:val="22"/>
+          <w:sz w:val="26"/>
         </w:rPr>
-        <w:t xml:space="preserve">Engineering artifacts  </w:t>
-      </w:r>
-      <w:r>
-        <w:rPr>
-          <w:rFonts w:ascii="Calibri" w:hAnsi="Calibri"/>
-          <w:b w:val="0"/>
-          <w:i w:val="0"/>
-          <w:color w:val="17324D"/>
-          <w:sz w:val="22"/>
-        </w:rPr>
-        <w:t>Stable controlled identities carry immutable numbered revisions. Returns retain history; corrections create successors rather than overwriting approved facts.</w:t>
+        <w:t>5  Traceability, operation, and boundaries</w:t>
       </w:r>
     </w:p>
     <w:p>
       <w:pPr>
-        <w:keepNext w:val="0"/>
-        <w:spacing w:before="0" w:after="100" w:line="264" w:lineRule="auto"/>
+        <w:spacing w:after="80" w:line="250" w:lineRule="auto"/>
       </w:pPr>
       <w:r>
-        <w:rPr>
-          <w:rFonts w:ascii="Calibri" w:hAnsi="Calibri"/>
-          <w:b/>
-          <w:i w:val="0"/>
-          <w:color w:val="2E74B5"/>
-          <w:sz w:val="22"/>
-        </w:rPr>
-        <w:t xml:space="preserve">Build configuration  </w:t>
-      </w:r>
-      <w:r>
-        <w:rPr>
-          <w:rFonts w:ascii="Calibri" w:hAnsi="Calibri"/>
-          <w:b w:val="0"/>
-          <w:i w:val="0"/>
-          <w:color w:val="17324D"/>
-          <w:sz w:val="22"/>
-        </w:rPr>
-        <w:t>Candidate baselines select exact approved requirement revisions. Software-build and release records identify the immutable configuration that verification and release decisions address.</w:t>
+        <w:t>Digital Thread follows exact build-selected SYSR, HLR, LLR, procedure, execution/result, checksummed evidence, and software-build records. GitLab remains authoritative for implementation code; AeroLink stores immutable links from exact approved LLR revisions to GitLab merge requests and merge commit SHAs, or a justified no-code decision.</w:t>
       </w:r>
     </w:p>
     <w:p>
       <w:pPr>
-        <w:keepNext w:val="0"/>
-        <w:spacing w:before="0" w:after="100" w:line="264" w:lineRule="auto"/>
+        <w:spacing w:after="80" w:line="250" w:lineRule="auto"/>
       </w:pPr>
       <w:r>
-        <w:rPr>
-          <w:rFonts w:ascii="Calibri" w:hAnsi="Calibri"/>
-          <w:b/>
-          <w:i w:val="0"/>
-          <w:color w:val="2E74B5"/>
-          <w:sz w:val="22"/>
-        </w:rPr>
-        <w:t xml:space="preserve">Documents and evidence  </w:t>
-      </w:r>
-      <w:r>
-        <w:rPr>
-          <w:rFonts w:ascii="Calibri" w:hAnsi="Calibri"/>
-          <w:b w:val="0"/>
-          <w:i w:val="0"/>
-          <w:color w:val="17324D"/>
-          <w:sz w:val="22"/>
-        </w:rPr>
-        <w:t>Generated DOCX/PDF outputs and release packages record source baseline, template revision, content hashes, procedures, executions, and evidence references.</w:t>
+        <w:t>The PostgreSQL database, controlled evidence store, and runtime configuration are backed up together into integrity-manifested archives. A daily Windows task can run the same backup engine; restore validation is isolated. Quality gates cover domain/API suites, client lint/type-check/build, browser workflows, PostgreSQL migrations, production hosting, Windows launchers, and exact-merge requalification.</w:t>
       </w:r>
     </w:p>
-    <w:p>
-      <w:pPr>
-        <w:pStyle w:val="Heading1"/>
-      </w:pPr>
-      <w:r>
-        <w:t>5. Traceability and external authorities</w:t>
-      </w:r>
-    </w:p>
-    <w:p>
-      <w:pPr>
-        <w:keepNext w:val="0"/>
-        <w:spacing w:before="0" w:after="140" w:line="264" w:lineRule="auto"/>
-      </w:pPr>
-      <w:r>
-        <w:rPr>
-          <w:rFonts w:ascii="Calibri" w:hAnsi="Calibri"/>
-          <w:b w:val="0"/>
-          <w:i w:val="0"/>
-          <w:color w:val="17324D"/>
-          <w:sz w:val="22"/>
-        </w:rPr>
-        <w:t>Digital Thread follows exact baseline revisions through SYSR → HLR → LLR → procedure → execution/result → evidence → software build. When several procedures cover an exact requirement, it prefers a build-scoped result with linked checksummed evidence; an external text reference remains context, not proof of an attached file.</w:t>
-      </w:r>
-    </w:p>
-    <w:p>
-      <w:pPr>
-        <w:keepNext w:val="0"/>
-        <w:spacing w:before="0" w:after="140" w:line="264" w:lineRule="auto"/>
-      </w:pPr>
-      <w:r>
-        <w:rPr>
-          <w:rFonts w:ascii="Calibri" w:hAnsi="Calibri"/>
-          <w:b w:val="0"/>
-          <w:i w:val="0"/>
-          <w:color w:val="17324D"/>
-          <w:sz w:val="22"/>
-        </w:rPr>
-        <w:t>GitLab remains authoritative for repositories, source, merge requests, review, CI, and commit content. AeroLink records an immutable pointer from an exact approved LLR revision to a GitLab MR and merge commit SHA, or a justified No code change required decision. The same exact-LLR scope drives the Code workspace, release gate, and signed review manifest; AeroLink does not host or review code.</w:t>
-      </w:r>
-    </w:p>
-    <w:p>
-      <w:pPr>
-        <w:pStyle w:val="Heading1"/>
-      </w:pPr>
-      <w:r>
-        <w:t>6. Identity, review, and electronic signatures</w:t>
-      </w:r>
-    </w:p>
-    <w:p>
-      <w:pPr>
-        <w:keepNext w:val="0"/>
-        <w:spacing w:before="0" w:after="140" w:line="264" w:lineRule="auto"/>
-      </w:pPr>
-      <w:r>
-        <w:rPr>
-          <w:rFonts w:ascii="Calibri" w:hAnsi="Calibri"/>
-          <w:b w:val="0"/>
-          <w:i w:val="0"/>
-          <w:color w:val="17324D"/>
-          <w:sz w:val="22"/>
-        </w:rPr>
-        <w:t>Authentication uses revocable server sessions, password hashing, Program membership, roles, and time-bounded delegations. Material approvals use password confirmation and retain signer identity, authority, time, and signed content context. Authors cannot independently approve controlled work where role separation is required; returned work retains its prior rationale and review history.</w:t>
-      </w:r>
-    </w:p>
-    <w:p>
-      <w:pPr>
-        <w:pStyle w:val="Heading1"/>
-      </w:pPr>
-      <w:r>
-        <w:t>7. Backup, recovery, and qualification</w:t>
-      </w:r>
-    </w:p>
-    <w:p>
-      <w:pPr>
-        <w:keepNext w:val="0"/>
-        <w:spacing w:before="0" w:after="140" w:line="264" w:lineRule="auto"/>
-      </w:pPr>
-      <w:r>
-        <w:rPr>
-          <w:rFonts w:ascii="Calibri" w:hAnsi="Calibri"/>
-          <w:b w:val="0"/>
-          <w:i w:val="0"/>
-          <w:color w:val="17324D"/>
-          <w:sz w:val="22"/>
-        </w:rPr>
-        <w:t>The persistent PostgreSQL database, controlled evidence store, and runtime configuration are backed up together into integrity-manifested archives. A Windows scheduled task runs the same verified engine daily by default; schedule and retention can evolve. Restore validation is isolated so it cannot replace the live database accidentally.</w:t>
-      </w:r>
-    </w:p>
-    <w:p>
-      <w:pPr>
-        <w:keepNext w:val="0"/>
-        <w:spacing w:before="0" w:after="140" w:line="264" w:lineRule="auto"/>
-      </w:pPr>
-      <w:r>
-        <w:rPr>
-          <w:rFonts w:ascii="Calibri" w:hAnsi="Calibri"/>
-          <w:b w:val="0"/>
-          <w:i w:val="0"/>
-          <w:color w:val="17324D"/>
-          <w:sz w:val="22"/>
-        </w:rPr>
-        <w:t>Quality gates include domain and API suites, client lint/type-check/build, Playwright role and workflow journeys, production hosting tests, PostgreSQL bootstrap/migration validation, and exact-merge requalification. The FMS records are explicitly demonstration data; demo seeding and accounts are disabled by production configuration.</w:t>
-      </w:r>
-    </w:p>
-    <w:p>
-      <w:pPr>
-        <w:pStyle w:val="Heading1"/>
-      </w:pPr>
-      <w:r>
-        <w:t>8. Deliberate boundaries</w:t>
-      </w:r>
-    </w:p>
-    <w:p>
-      <w:pPr>
-        <w:keepNext w:val="0"/>
-        <w:spacing w:before="0" w:after="0" w:line="264" w:lineRule="auto"/>
-      </w:pPr>
-      <w:r>
-        <w:rPr>
-          <w:rFonts w:ascii="Calibri" w:hAnsi="Calibri"/>
-          <w:b w:val="0"/>
-          <w:i w:val="0"/>
-          <w:color w:val="17324D"/>
-          <w:sz w:val="22"/>
-        </w:rPr>
-        <w:t>AeroLink governs lifecycle data and evidence. It does not execute tests, host source code, approve GitLab merges, claim certification, or replace organizational process authority. External test systems and GitLab remain authoritative for execution and code; AeroLink connects their evidence to the exact controlled revisions and build used for a release decision.</w:t>
-      </w:r>
-    </w:p>
+    <w:tbl>
+      <w:tblPr>
+        <w:tblW w:type="auto" w:w="0"/>
+        <w:tblLook w:firstColumn="1" w:firstRow="1" w:lastColumn="0" w:lastRow="0" w:noHBand="0" w:noVBand="1" w:val="04A0"/>
+      </w:tblPr>
+      <w:tblGrid>
+        <w:gridCol w:w="10282"/>
+      </w:tblGrid>
+      <w:tr>
+        <w:tc>
+          <w:tcPr>
+            <w:tcW w:type="dxa" w:w="10282"/>
+            <w:shd w:fill="FFF6D9"/>
+          </w:tcPr>
+          <w:p>
+            <w:r>
+              <w:rPr>
+                <w:b/>
+                <w:color w:val="102A43"/>
+              </w:rPr>
+              <w:t xml:space="preserve">Boundary: </w:t>
+            </w:r>
+            <w:r>
+              <w:t>AeroLink governs lifecycle data and evidence. It does not execute tests, host source code, replace Microsoft Word, approve GitLab merges, claim certification, or replace organizational process authority.</w:t>
+            </w:r>
+          </w:p>
+        </w:tc>
+      </w:tr>
+    </w:tbl>
     <w:sectPr>
-      <w:headerReference w:type="default" r:id="rId9"/>
-      <w:footerReference w:type="default" r:id="rId10"/>
+      <w:headerReference w:type="default" r:id="rId11"/>
+      <w:footerReference w:type="default" r:id="rId12"/>
       <w:pgSz w:w="12240" w:h="15840"/>
-      <w:pgMar w:top="1080" w:right="1181" w:bottom="1037" w:left="1181" w:header="576" w:footer="576" w:gutter="0"/>
+      <w:pgMar w:top="835" w:right="979" w:bottom="792" w:left="979" w:header="720" w:footer="720" w:gutter="0"/>
       <w:cols w:space="720"/>
       <w:docGrid w:linePitch="360"/>
     </w:sectPr>
@@ -569,19 +611,33 @@
   <w:p>
     <w:pPr>
       <w:pStyle w:val="Footer"/>
-      <w:jc w:val="right"/>
+      <w:jc w:val="center"/>
     </w:pPr>
     <w:r>
       <w:rPr>
-        <w:rFonts w:ascii="Calibri" w:hAnsi="Calibri"/>
-        <w:b w:val="0"/>
-        <w:i w:val="0"/>
-        <w:color w:val="5C6C7E"/>
-        <w:sz w:val="17"/>
-      </w:rPr>
-      <w:t xml:space="preserve">AeroLink • 2 August 2026 • Page </w:t>
+        <w:color w:val="526274"/>
+        <w:sz w:val="15"/>
+      </w:rPr>
+      <w:t>Current implementation brief  |  6 August 2026  |  Controlled project handoff</w:t>
     </w:r>
-    <w:fldSimple w:instr="PAGE"/>
+  </w:p>
+</w:ftr>
+</file>
+
+<file path=word/footer2.xml><?xml version="1.0" encoding="utf-8"?>
+<w:ftr xmlns:m="http://schemas.openxmlformats.org/officeDocument/2006/math" xmlns:mc="http://schemas.openxmlformats.org/markup-compatibility/2006" xmlns:mo="http://schemas.microsoft.com/office/mac/office/2008/main" xmlns:mv="urn:schemas-microsoft-com:mac:vml" xmlns:o="urn:schemas-microsoft-com:office:office" xmlns:r="http://schemas.openxmlformats.org/officeDocument/2006/relationships" xmlns:v="urn:schemas-microsoft-com:vml" xmlns:w10="urn:schemas-microsoft-com:office:word" xmlns:w14="http://schemas.microsoft.com/office/word/2010/wordml" xmlns:w="http://schemas.openxmlformats.org/wordprocessingml/2006/main" xmlns:wne="http://schemas.microsoft.com/office/word/2006/wordml" xmlns:wp14="http://schemas.microsoft.com/office/word/2010/wordprocessingDrawing" xmlns:wp="http://schemas.openxmlformats.org/drawingml/2006/wordprocessingDrawing" xmlns:wpc="http://schemas.microsoft.com/office/word/2010/wordprocessingCanvas" xmlns:wpg="http://schemas.microsoft.com/office/word/2010/wordprocessingGroup" xmlns:wpi="http://schemas.microsoft.com/office/word/2010/wordprocessingInk" xmlns:wps="http://schemas.microsoft.com/office/word/2010/wordprocessingShape" mc:Ignorable="w14 wp14">
+  <w:p>
+    <w:pPr>
+      <w:pStyle w:val="Footer"/>
+      <w:jc w:val="center"/>
+    </w:pPr>
+    <w:r>
+      <w:rPr>
+        <w:color w:val="526274"/>
+        <w:sz w:val="15"/>
+      </w:rPr>
+      <w:t>Current implementation brief  |  6 August 2026  |  Controlled project handoff</w:t>
+    </w:r>
   </w:p>
 </w:ftr>
 </file>
@@ -591,25 +647,42 @@
   <w:p>
     <w:pPr>
       <w:pStyle w:val="Header"/>
-      <w:tabs>
-        <w:tab w:pos="9072" w:val="left"/>
-      </w:tabs>
-      <w:spacing w:after="60"/>
+      <w:jc w:val="right"/>
       <w:pBdr>
-        <w:bottom w:val="single" w:sz="6" w:space="4" w:color="D5DEE8"/>
+        <w:bottom w:val="single" w:sz="8" w:space="6" w:color="168578"/>
       </w:pBdr>
     </w:pPr>
     <w:r>
       <w:rPr>
-        <w:rFonts w:ascii="Calibri" w:hAnsi="Calibri"/>
-        <w:b/>
-        <w:i w:val="0"/>
-        <w:color w:val="5C6C7E"/>
-        <w:sz w:val="17"/>
-      </w:rPr>
-      <w:t>AEROLINK TECHNICAL BRIEF</w:t>
-      <w:tab/>
-      <w:t>CURRENT IMPLEMENTATION</w:t>
+        <w:rFonts w:ascii="Aptos Display" w:hAnsi="Aptos Display"/>
+        <w:b/>
+        <w:color w:val="168578"/>
+        <w:sz w:val="16"/>
+      </w:rPr>
+      <w:t>AEROLINK  /  TECHNICAL OVERVIEW</w:t>
+    </w:r>
+  </w:p>
+</w:hdr>
+</file>
+
+<file path=word/header2.xml><?xml version="1.0" encoding="utf-8"?>
+<w:hdr xmlns:m="http://schemas.openxmlformats.org/officeDocument/2006/math" xmlns:mc="http://schemas.openxmlformats.org/markup-compatibility/2006" xmlns:mo="http://schemas.microsoft.com/office/mac/office/2008/main" xmlns:mv="urn:schemas-microsoft-com:mac:vml" xmlns:o="urn:schemas-microsoft-com:office:office" xmlns:r="http://schemas.openxmlformats.org/officeDocument/2006/relationships" xmlns:v="urn:schemas-microsoft-com:vml" xmlns:w10="urn:schemas-microsoft-com:office:word" xmlns:w14="http://schemas.microsoft.com/office/word/2010/wordml" xmlns:w="http://schemas.openxmlformats.org/wordprocessingml/2006/main" xmlns:wne="http://schemas.microsoft.com/office/word/2006/wordml" xmlns:wp14="http://schemas.microsoft.com/office/word/2010/wordprocessingDrawing" xmlns:wp="http://schemas.openxmlformats.org/drawingml/2006/wordprocessingDrawing" xmlns:wpc="http://schemas.microsoft.com/office/word/2010/wordprocessingCanvas" xmlns:wpg="http://schemas.microsoft.com/office/word/2010/wordprocessingGroup" xmlns:wpi="http://schemas.microsoft.com/office/word/2010/wordprocessingInk" xmlns:wps="http://schemas.microsoft.com/office/word/2010/wordprocessingShape" mc:Ignorable="w14 wp14">
+  <w:p>
+    <w:pPr>
+      <w:pStyle w:val="Header"/>
+      <w:jc w:val="right"/>
+      <w:pBdr>
+        <w:bottom w:val="single" w:sz="8" w:space="6" w:color="168578"/>
+      </w:pBdr>
+    </w:pPr>
+    <w:r>
+      <w:rPr>
+        <w:rFonts w:ascii="Aptos Display" w:hAnsi="Aptos Display"/>
+        <w:b/>
+        <w:color w:val="168578"/>
+        <w:sz w:val="16"/>
+      </w:rPr>
+      <w:t>AEROLINK  /  TECHNICAL OVERVIEW</w:t>
     </w:r>
   </w:p>
 </w:hdr>
@@ -979,12 +1052,12 @@
     <w:qFormat/>
     <w:rsid w:val="00FC693F"/>
     <w:pPr>
-      <w:spacing w:after="120" w:line="264" w:lineRule="auto"/>
+      <w:spacing w:after="60"/>
     </w:pPr>
     <w:rPr>
-      <w:rFonts w:ascii="Calibri" w:hAnsi="Calibri"/>
-      <w:color w:val="17324D"/>
-      <w:sz w:val="22"/>
+      <w:rFonts w:ascii="Aptos" w:hAnsi="Aptos"/>
+      <w:color w:val="25364D"/>
+      <w:sz w:val="18"/>
     </w:rPr>
   </w:style>
   <w:style w:type="paragraph" w:styleId="Header">
@@ -1042,15 +1115,15 @@
     <w:pPr>
       <w:keepNext/>
       <w:keepLines/>
-      <w:spacing w:before="280" w:after="120"/>
+      <w:spacing w:before="480" w:after="0"/>
       <w:outlineLvl w:val="0"/>
     </w:pPr>
     <w:rPr>
-      <w:rFonts w:asciiTheme="majorHAnsi" w:eastAsiaTheme="majorEastAsia" w:hAnsiTheme="majorHAnsi" w:cstheme="majorBidi" w:ascii="Calibri" w:hAnsi="Calibri"/>
+      <w:rFonts w:asciiTheme="majorHAnsi" w:eastAsiaTheme="majorEastAsia" w:hAnsiTheme="majorHAnsi" w:cstheme="majorBidi"/>
       <w:b/>
       <w:bCs/>
-      <w:color w:val="2E74B5"/>
-      <w:sz w:val="32"/>
+      <w:color w:val="365F91" w:themeColor="accent1" w:themeShade="BF"/>
+      <w:sz w:val="28"/>
       <w:szCs w:val="28"/>
     </w:rPr>
   </w:style>
@@ -1066,14 +1139,14 @@
     <w:pPr>
       <w:keepNext/>
       <w:keepLines/>
-      <w:spacing w:before="200" w:after="100"/>
+      <w:spacing w:before="200" w:after="0"/>
       <w:outlineLvl w:val="1"/>
     </w:pPr>
     <w:rPr>
-      <w:rFonts w:asciiTheme="majorHAnsi" w:eastAsiaTheme="majorEastAsia" w:hAnsiTheme="majorHAnsi" w:cstheme="majorBidi" w:ascii="Calibri" w:hAnsi="Calibri"/>
+      <w:rFonts w:asciiTheme="majorHAnsi" w:eastAsiaTheme="majorEastAsia" w:hAnsiTheme="majorHAnsi" w:cstheme="majorBidi"/>
       <w:b/>
       <w:bCs/>
-      <w:color w:val="2E74B5"/>
+      <w:color w:val="4F81BD" w:themeColor="accent1"/>
       <w:sz w:val="26"/>
       <w:szCs w:val="26"/>
     </w:rPr>
@@ -1090,15 +1163,14 @@
     <w:pPr>
       <w:keepNext/>
       <w:keepLines/>
-      <w:spacing w:before="160" w:after="80"/>
+      <w:spacing w:before="200" w:after="0"/>
       <w:outlineLvl w:val="2"/>
     </w:pPr>
     <w:rPr>
-      <w:rFonts w:asciiTheme="majorHAnsi" w:eastAsiaTheme="majorEastAsia" w:hAnsiTheme="majorHAnsi" w:cstheme="majorBidi" w:ascii="Calibri" w:hAnsi="Calibri"/>
+      <w:rFonts w:asciiTheme="majorHAnsi" w:eastAsiaTheme="majorEastAsia" w:hAnsiTheme="majorHAnsi" w:cstheme="majorBidi"/>
       <w:b/>
       <w:bCs/>
-      <w:color w:val="17324D"/>
-      <w:sz w:val="24"/>
+      <w:color w:val="4F81BD" w:themeColor="accent1"/>
     </w:rPr>
   </w:style>
   <w:style w:type="paragraph" w:styleId="Heading4">
@@ -1516,6 +1588,11 @@
       </w:numPr>
       <w:contextualSpacing/>
     </w:pPr>
+    <w:rPr>
+      <w:rFonts w:ascii="Aptos" w:hAnsi="Aptos"/>
+      <w:color w:val="25364D"/>
+      <w:sz w:val="17"/>
+    </w:rPr>
   </w:style>
   <w:style w:type="paragraph" w:styleId="ListBullet2">
     <w:name w:val="List Bullet 2"/>

</xml_diff>